<commit_message>
Add Hangul Day SMS send-list builder and send-list section to the Word plan
Co-Authored-By: Claude Opus 5.5 <noreply@anthropic.com>
Claude-Session: https://claude.ai/code/session_01MNAKb9sccB4tN87nMGAtUU
</commit_message>
<xml_diff>
--- a/crm/output/용산_한글날_시승오퍼_실행계획_1006-1009.docx
+++ b/crm/output/용산_한글날_시승오퍼_실행계획_1006-1009.docx
@@ -5042,7 +5042,7 @@
                 <w:sz w:val="17"/>
                 <w:szCs w:val="17"/>
               </w:rPr>
-              <w:t xml:space="preserve"> 발송: 용산 거래고객 132명 + 동의 신규 671명</w:t>
+              <w:t xml:space="preserve"> 발송: 동의 760명 (거래고객·수강생 91 + 신규 동의 669) — 4절 명단</w:t>
             </w:r>
           </w:p>
         </w:tc>
@@ -5589,7 +5589,24 @@
           <w:sz w:val="20"/>
           <w:szCs w:val="20"/>
         </w:rPr>
-        <w:t xml:space="preserve"> 연휴 3일 확보 대여 시간 ≥ 120시간(24시간 기준 약 8%). 미달이면 문자 2차 대상에 마케팅 수신 미응답 회원 54명을 추가하고, 단골 직접 연락 1차 무응답자에게 다시 연락한다.</w:t>
+        <w:t xml:space="preserve"> 연휴 3일 확보 대여 시간 ≥ 120시간(24시간 기준 약 8%). 미달이면 문자 2차 대상에 마케팅 수신 미응답 거래고객 56명(</w:t>
+      </w:r>
+      <w:r>
+        <w:rPr>
+          <w:rFonts w:ascii="Consolas" w:cs="Consolas" w:eastAsia="Consolas" w:hAnsi="Consolas"/>
+          <w:color w:val="7C2D12"/>
+          <w:sz w:val="18"/>
+          <w:szCs w:val="18"/>
+        </w:rPr>
+        <w:t xml:space="preserve">2_문자1차_미응답_선택</w:t>
+      </w:r>
+      <w:r>
+        <w:rPr>
+          <w:rFonts w:ascii="Malgun Gothic" w:cs="Malgun Gothic" w:eastAsia="Malgun Gothic" w:hAnsi="Malgun Gothic"/>
+          <w:sz w:val="20"/>
+          <w:szCs w:val="20"/>
+        </w:rPr>
+        <w:t xml:space="preserve"> 시트)을 추가하고, 단골 직접 연락 1차 무응답자에게 다시 연락한다.</w:t>
       </w:r>
     </w:p>
     <w:p>
@@ -5816,6 +5833,100 @@
                 <w:sz w:val="17"/>
                 <w:szCs w:val="17"/>
               </w:rPr>
+              <w:t xml:space="preserve">오전</w:t>
+            </w:r>
+          </w:p>
+        </w:tc>
+        <w:tc>
+          <w:tcPr>
+            <w:tcW w:type="dxa" w:w="6807"/>
+            <w:tcMar>
+              <w:top w:type="dxa" w:w="60"/>
+              <w:left w:type="dxa" w:w="90"/>
+              <w:bottom w:type="dxa" w:w="60"/>
+              <w:right w:type="dxa" w:w="90"/>
+            </w:tcMar>
+          </w:tcPr>
+          <w:p>
+            <w:pPr>
+              <w:spacing w:after="0"/>
+            </w:pPr>
+            <w:r>
+              <w:rPr>
+                <w:rFonts w:ascii="Malgun Gothic" w:cs="Malgun Gothic" w:eastAsia="Malgun Gothic" w:hAnsi="Malgun Gothic"/>
+                <w:sz w:val="17"/>
+                <w:szCs w:val="17"/>
+              </w:rPr>
+              <w:t xml:space="preserve">최신 결제내역을 raw/ 에 넣고 </w:t>
+            </w:r>
+            <w:r>
+              <w:rPr>
+                <w:rFonts w:ascii="Consolas" w:cs="Consolas" w:eastAsia="Consolas" w:hAnsi="Consolas"/>
+                <w:color w:val="7C2D12"/>
+                <w:sz w:val="17"/>
+                <w:szCs w:val="17"/>
+              </w:rPr>
+              <w:t xml:space="preserve">build_send_1009hangul.py</w:t>
+            </w:r>
+            <w:r>
+              <w:rPr>
+                <w:rFonts w:ascii="Malgun Gothic" w:cs="Malgun Gothic" w:eastAsia="Malgun Gothic" w:hAnsi="Malgun Gothic"/>
+                <w:sz w:val="17"/>
+                <w:szCs w:val="17"/>
+              </w:rPr>
+              <w:t xml:space="preserve"> 재실행 → 그 사이 예약한 사람 제외</w:t>
+            </w:r>
+          </w:p>
+        </w:tc>
+        <w:tc>
+          <w:tcPr>
+            <w:tcW w:type="dxa" w:w="1021"/>
+            <w:tcMar>
+              <w:top w:type="dxa" w:w="60"/>
+              <w:left w:type="dxa" w:w="90"/>
+              <w:bottom w:type="dxa" w:w="60"/>
+              <w:right w:type="dxa" w:w="90"/>
+            </w:tcMar>
+          </w:tcPr>
+          <w:p>
+            <w:pPr>
+              <w:spacing w:after="0"/>
+            </w:pPr>
+            <w:r>
+              <w:rPr>
+                <w:rFonts w:ascii="Malgun Gothic" w:cs="Malgun Gothic" w:eastAsia="Malgun Gothic" w:hAnsi="Malgun Gothic"/>
+                <w:sz w:val="17"/>
+                <w:szCs w:val="17"/>
+              </w:rPr>
+              <w:t xml:space="preserve">마케팅</w:t>
+            </w:r>
+          </w:p>
+        </w:tc>
+      </w:tr>
+      <w:tr>
+        <w:trPr>
+          <w:tblHeader w:val="false"/>
+        </w:trPr>
+        <w:tc>
+          <w:tcPr>
+            <w:tcW w:type="dxa" w:w="1532"/>
+            <w:tcMar>
+              <w:top w:type="dxa" w:w="60"/>
+              <w:left w:type="dxa" w:w="90"/>
+              <w:bottom w:type="dxa" w:w="60"/>
+              <w:right w:type="dxa" w:w="90"/>
+            </w:tcMar>
+          </w:tcPr>
+          <w:p>
+            <w:pPr>
+              <w:spacing w:after="0"/>
+            </w:pPr>
+            <w:r>
+              <w:rPr>
+                <w:rFonts w:ascii="Malgun Gothic" w:cs="Malgun Gothic" w:eastAsia="Malgun Gothic" w:hAnsi="Malgun Gothic"/>
+                <w:sz w:val="17"/>
+                <w:szCs w:val="17"/>
+              </w:rPr>
               <w:t xml:space="preserve">12:00</w:t>
             </w:r>
           </w:p>
@@ -5850,24 +5961,7 @@
                 <w:sz w:val="17"/>
                 <w:szCs w:val="17"/>
               </w:rPr>
-              <w:t xml:space="preserve">: 1차 링크 클릭 후 미결제자 + </w:t>
-            </w:r>
-            <w:r>
-              <w:rPr>
-                <w:rFonts w:ascii="Consolas" w:cs="Consolas" w:eastAsia="Consolas" w:hAnsi="Consolas"/>
-                <w:color w:val="7C2D12"/>
-                <w:sz w:val="17"/>
-                <w:szCs w:val="17"/>
-              </w:rPr>
-              <w:t xml:space="preserve">1001week</w:t>
-            </w:r>
-            <w:r>
-              <w:rPr>
-                <w:rFonts w:ascii="Malgun Gothic" w:cs="Malgun Gothic" w:eastAsia="Malgun Gothic" w:hAnsi="Malgun Gothic"/>
-                <w:sz w:val="17"/>
-                <w:szCs w:val="17"/>
-              </w:rPr>
-              <w:t xml:space="preserve"> 링크 방문 후 미결제자. "평일 40% 오늘 마지막 + 연휴 한 시간 더"</w:t>
+              <w:t xml:space="preserve">: 1차 대상 중 아직 예약하지 않은 사람. "평일 40% 오늘 마지막 + 연휴 한 시간 더"</w:t>
             </w:r>
           </w:p>
         </w:tc>
@@ -7004,7 +7098,763 @@
           <w:sz w:val="28"/>
           <w:szCs w:val="28"/>
         </w:rPr>
-        <w:t xml:space="preserve">4. 문자 문안</w:t>
+        <w:t xml:space="preserve">4. 문자 발송 명단</w:t>
+      </w:r>
+    </w:p>
+    <w:p>
+      <w:pPr>
+        <w:spacing w:after="100"/>
+      </w:pPr>
+      <w:r>
+        <w:rPr>
+          <w:rFonts w:ascii="Malgun Gothic" w:cs="Malgun Gothic" w:eastAsia="Malgun Gothic" w:hAnsi="Malgun Gothic"/>
+          <w:sz w:val="20"/>
+          <w:szCs w:val="20"/>
+        </w:rPr>
+        <w:t xml:space="preserve">파일: </w:t>
+      </w:r>
+      <w:r>
+        <w:rPr>
+          <w:rFonts w:ascii="Consolas" w:cs="Consolas" w:eastAsia="Consolas" w:hAnsi="Consolas"/>
+          <w:color w:val="7C2D12"/>
+          <w:sz w:val="18"/>
+          <w:szCs w:val="18"/>
+        </w:rPr>
+        <w:t xml:space="preserve">crm/output/발송명단_2026-10-07_1000_1009hangul.xlsx</w:t>
+      </w:r>
+      <w:r>
+        <w:rPr>
+          <w:rFonts w:ascii="Malgun Gothic" w:cs="Malgun Gothic" w:eastAsia="Malgun Gothic" w:hAnsi="Malgun Gothic"/>
+          <w:sz w:val="20"/>
+          <w:szCs w:val="20"/>
+        </w:rPr>
+        <w:t xml:space="preserve"> (이름·연락처 포함, 저장소에는 올리지 않음). 만드는 스크립트: </w:t>
+      </w:r>
+      <w:r>
+        <w:rPr>
+          <w:rFonts w:ascii="Consolas" w:cs="Consolas" w:eastAsia="Consolas" w:hAnsi="Consolas"/>
+          <w:color w:val="7C2D12"/>
+          <w:sz w:val="18"/>
+          <w:szCs w:val="18"/>
+        </w:rPr>
+        <w:t xml:space="preserve">crm/scripts/build_send_1009hangul.py</w:t>
+      </w:r>
+      <w:r>
+        <w:rPr>
+          <w:rFonts w:ascii="Malgun Gothic" w:cs="Malgun Gothic" w:eastAsia="Malgun Gothic" w:hAnsi="Malgun Gothic"/>
+          <w:sz w:val="20"/>
+          <w:szCs w:val="20"/>
+        </w:rPr>
+        <w:t xml:space="preserve">.</w:t>
+      </w:r>
+    </w:p>
+    <w:tbl>
+      <w:tblPr>
+        <w:tblW w:type="dxa" w:w="9360"/>
+        <w:tblBorders>
+          <w:top w:val="single" w:color="auto" w:sz="4"/>
+          <w:left w:val="single" w:color="auto" w:sz="4"/>
+          <w:bottom w:val="single" w:color="auto" w:sz="4"/>
+          <w:right w:val="single" w:color="auto" w:sz="4"/>
+          <w:insideH w:val="single" w:color="auto" w:sz="4"/>
+          <w:insideV w:val="single" w:color="auto" w:sz="4"/>
+        </w:tblBorders>
+      </w:tblPr>
+      <w:tblGrid>
+        <w:gridCol w:w="1352"/>
+        <w:gridCol w:w="3848"/>
+        <w:gridCol w:w="4160"/>
+      </w:tblGrid>
+      <w:tr>
+        <w:trPr>
+          <w:tblHeader/>
+        </w:trPr>
+        <w:tc>
+          <w:tcPr>
+            <w:tcW w:type="dxa" w:w="1352"/>
+            <w:shd w:fill="1C1917" w:color="auto" w:val="clear"/>
+            <w:tcMar>
+              <w:top w:type="dxa" w:w="60"/>
+              <w:left w:type="dxa" w:w="90"/>
+              <w:bottom w:type="dxa" w:w="60"/>
+              <w:right w:type="dxa" w:w="90"/>
+            </w:tcMar>
+          </w:tcPr>
+          <w:p>
+            <w:pPr>
+              <w:spacing w:after="0"/>
+            </w:pPr>
+            <w:r>
+              <w:rPr>
+                <w:rFonts w:ascii="Malgun Gothic" w:cs="Malgun Gothic" w:eastAsia="Malgun Gothic" w:hAnsi="Malgun Gothic"/>
+                <w:b/>
+                <w:bCs/>
+                <w:color w:val="FFFFFF"/>
+                <w:sz w:val="17"/>
+                <w:szCs w:val="17"/>
+              </w:rPr>
+              <w:t xml:space="preserve">시트</w:t>
+            </w:r>
+          </w:p>
+        </w:tc>
+        <w:tc>
+          <w:tcPr>
+            <w:tcW w:type="dxa" w:w="3848"/>
+            <w:shd w:fill="1C1917" w:color="auto" w:val="clear"/>
+            <w:tcMar>
+              <w:top w:type="dxa" w:w="60"/>
+              <w:left w:type="dxa" w:w="90"/>
+              <w:bottom w:type="dxa" w:w="60"/>
+              <w:right w:type="dxa" w:w="90"/>
+            </w:tcMar>
+          </w:tcPr>
+          <w:p>
+            <w:pPr>
+              <w:spacing w:after="0"/>
+            </w:pPr>
+            <w:r>
+              <w:rPr>
+                <w:rFonts w:ascii="Malgun Gothic" w:cs="Malgun Gothic" w:eastAsia="Malgun Gothic" w:hAnsi="Malgun Gothic"/>
+                <w:b/>
+                <w:bCs/>
+                <w:color w:val="FFFFFF"/>
+                <w:sz w:val="17"/>
+                <w:szCs w:val="17"/>
+              </w:rPr>
+              <w:t xml:space="preserve">인원</w:t>
+            </w:r>
+          </w:p>
+        </w:tc>
+        <w:tc>
+          <w:tcPr>
+            <w:tcW w:type="dxa" w:w="4160"/>
+            <w:shd w:fill="1C1917" w:color="auto" w:val="clear"/>
+            <w:tcMar>
+              <w:top w:type="dxa" w:w="60"/>
+              <w:left w:type="dxa" w:w="90"/>
+              <w:bottom w:type="dxa" w:w="60"/>
+              <w:right w:type="dxa" w:w="90"/>
+            </w:tcMar>
+          </w:tcPr>
+          <w:p>
+            <w:pPr>
+              <w:spacing w:after="0"/>
+            </w:pPr>
+            <w:r>
+              <w:rPr>
+                <w:rFonts w:ascii="Malgun Gothic" w:cs="Malgun Gothic" w:eastAsia="Malgun Gothic" w:hAnsi="Malgun Gothic"/>
+                <w:b/>
+                <w:bCs/>
+                <w:color w:val="FFFFFF"/>
+                <w:sz w:val="17"/>
+                <w:szCs w:val="17"/>
+              </w:rPr>
+              <w:t xml:space="preserve">용도</w:t>
+            </w:r>
+          </w:p>
+        </w:tc>
+      </w:tr>
+      <w:tr>
+        <w:trPr>
+          <w:tblHeader w:val="false"/>
+        </w:trPr>
+        <w:tc>
+          <w:tcPr>
+            <w:tcW w:type="dxa" w:w="1352"/>
+            <w:tcMar>
+              <w:top w:type="dxa" w:w="60"/>
+              <w:left w:type="dxa" w:w="90"/>
+              <w:bottom w:type="dxa" w:w="60"/>
+              <w:right w:type="dxa" w:w="90"/>
+            </w:tcMar>
+          </w:tcPr>
+          <w:p>
+            <w:pPr>
+              <w:spacing w:after="0"/>
+            </w:pPr>
+            <w:r>
+              <w:rPr>
+                <w:rFonts w:ascii="Malgun Gothic" w:cs="Malgun Gothic" w:eastAsia="Malgun Gothic" w:hAnsi="Malgun Gothic"/>
+                <w:sz w:val="17"/>
+                <w:szCs w:val="17"/>
+              </w:rPr>
+              <w:t xml:space="preserve">1_문자1차_동의</w:t>
+            </w:r>
+          </w:p>
+        </w:tc>
+        <w:tc>
+          <w:tcPr>
+            <w:tcW w:type="dxa" w:w="3848"/>
+            <w:tcMar>
+              <w:top w:type="dxa" w:w="60"/>
+              <w:left w:type="dxa" w:w="90"/>
+              <w:bottom w:type="dxa" w:w="60"/>
+              <w:right w:type="dxa" w:w="90"/>
+            </w:tcMar>
+          </w:tcPr>
+          <w:p>
+            <w:pPr>
+              <w:spacing w:after="0"/>
+            </w:pPr>
+            <w:r>
+              <w:rPr>
+                <w:rFonts w:ascii="Malgun Gothic" w:cs="Malgun Gothic" w:eastAsia="Malgun Gothic" w:hAnsi="Malgun Gothic"/>
+                <w:b/>
+                <w:bCs/>
+                <w:sz w:val="17"/>
+                <w:szCs w:val="17"/>
+              </w:rPr>
+              <w:t xml:space="preserve">760명</w:t>
+            </w:r>
+            <w:r>
+              <w:rPr>
+                <w:rFonts w:ascii="Malgun Gothic" w:cs="Malgun Gothic" w:eastAsia="Malgun Gothic" w:hAnsi="Malgun Gothic"/>
+                <w:sz w:val="17"/>
+                <w:szCs w:val="17"/>
+              </w:rPr>
+              <w:t xml:space="preserve"> (거래고객·수강생 91 + 9월 신규 동의 669)</w:t>
+            </w:r>
+          </w:p>
+        </w:tc>
+        <w:tc>
+          <w:tcPr>
+            <w:tcW w:type="dxa" w:w="4160"/>
+            <w:tcMar>
+              <w:top w:type="dxa" w:w="60"/>
+              <w:left w:type="dxa" w:w="90"/>
+              <w:bottom w:type="dxa" w:w="60"/>
+              <w:right w:type="dxa" w:w="90"/>
+            </w:tcMar>
+          </w:tcPr>
+          <w:p>
+            <w:pPr>
+              <w:spacing w:after="0"/>
+            </w:pPr>
+            <w:r>
+              <w:rPr>
+                <w:rFonts w:ascii="Malgun Gothic" w:cs="Malgun Gothic" w:eastAsia="Malgun Gothic" w:hAnsi="Malgun Gothic"/>
+                <w:sz w:val="17"/>
+                <w:szCs w:val="17"/>
+              </w:rPr>
+              <w:t xml:space="preserve">10/7 10:00 1차. 문자 툴에 그대로 붙여 넣는다</w:t>
+            </w:r>
+          </w:p>
+        </w:tc>
+      </w:tr>
+      <w:tr>
+        <w:trPr>
+          <w:tblHeader w:val="false"/>
+        </w:trPr>
+        <w:tc>
+          <w:tcPr>
+            <w:tcW w:type="dxa" w:w="1352"/>
+            <w:tcMar>
+              <w:top w:type="dxa" w:w="60"/>
+              <w:left w:type="dxa" w:w="90"/>
+              <w:bottom w:type="dxa" w:w="60"/>
+              <w:right w:type="dxa" w:w="90"/>
+            </w:tcMar>
+          </w:tcPr>
+          <w:p>
+            <w:pPr>
+              <w:spacing w:after="0"/>
+            </w:pPr>
+            <w:r>
+              <w:rPr>
+                <w:rFonts w:ascii="Malgun Gothic" w:cs="Malgun Gothic" w:eastAsia="Malgun Gothic" w:hAnsi="Malgun Gothic"/>
+                <w:sz w:val="17"/>
+                <w:szCs w:val="17"/>
+              </w:rPr>
+              <w:t xml:space="preserve">2_문자1차_미응답_선택</w:t>
+            </w:r>
+          </w:p>
+        </w:tc>
+        <w:tc>
+          <w:tcPr>
+            <w:tcW w:type="dxa" w:w="3848"/>
+            <w:tcMar>
+              <w:top w:type="dxa" w:w="60"/>
+              <w:left w:type="dxa" w:w="90"/>
+              <w:bottom w:type="dxa" w:w="60"/>
+              <w:right w:type="dxa" w:w="90"/>
+            </w:tcMar>
+          </w:tcPr>
+          <w:p>
+            <w:pPr>
+              <w:spacing w:after="0"/>
+            </w:pPr>
+            <w:r>
+              <w:rPr>
+                <w:rFonts w:ascii="Malgun Gothic" w:cs="Malgun Gothic" w:eastAsia="Malgun Gothic" w:hAnsi="Malgun Gothic"/>
+                <w:sz w:val="17"/>
+                <w:szCs w:val="17"/>
+              </w:rPr>
+              <w:t xml:space="preserve">56명</w:t>
+            </w:r>
+          </w:p>
+        </w:tc>
+        <w:tc>
+          <w:tcPr>
+            <w:tcW w:type="dxa" w:w="4160"/>
+            <w:tcMar>
+              <w:top w:type="dxa" w:w="60"/>
+              <w:left w:type="dxa" w:w="90"/>
+              <w:bottom w:type="dxa" w:w="60"/>
+              <w:right w:type="dxa" w:w="90"/>
+            </w:tcMar>
+          </w:tcPr>
+          <w:p>
+            <w:pPr>
+              <w:spacing w:after="0"/>
+            </w:pPr>
+            <w:r>
+              <w:rPr>
+                <w:rFonts w:ascii="Malgun Gothic" w:cs="Malgun Gothic" w:eastAsia="Malgun Gothic" w:hAnsi="Malgun Gothic"/>
+                <w:sz w:val="17"/>
+                <w:szCs w:val="17"/>
+              </w:rPr>
+              <w:t xml:space="preserve">수신동의 미응답 거래고객. 9/13 운영 결정대로 보낼지, 보수적으로 뺄지 선택</w:t>
+            </w:r>
+          </w:p>
+        </w:tc>
+      </w:tr>
+      <w:tr>
+        <w:trPr>
+          <w:tblHeader w:val="false"/>
+        </w:trPr>
+        <w:tc>
+          <w:tcPr>
+            <w:tcW w:type="dxa" w:w="1352"/>
+            <w:tcMar>
+              <w:top w:type="dxa" w:w="60"/>
+              <w:left w:type="dxa" w:w="90"/>
+              <w:bottom w:type="dxa" w:w="60"/>
+              <w:right w:type="dxa" w:w="90"/>
+            </w:tcMar>
+          </w:tcPr>
+          <w:p>
+            <w:pPr>
+              <w:spacing w:after="0"/>
+            </w:pPr>
+            <w:r>
+              <w:rPr>
+                <w:rFonts w:ascii="Malgun Gothic" w:cs="Malgun Gothic" w:eastAsia="Malgun Gothic" w:hAnsi="Malgun Gothic"/>
+                <w:sz w:val="17"/>
+                <w:szCs w:val="17"/>
+              </w:rPr>
+              <w:t xml:space="preserve">참고_단골직접연락</w:t>
+            </w:r>
+          </w:p>
+        </w:tc>
+        <w:tc>
+          <w:tcPr>
+            <w:tcW w:type="dxa" w:w="3848"/>
+            <w:tcMar>
+              <w:top w:type="dxa" w:w="60"/>
+              <w:left w:type="dxa" w:w="90"/>
+              <w:bottom w:type="dxa" w:w="60"/>
+              <w:right w:type="dxa" w:w="90"/>
+            </w:tcMar>
+          </w:tcPr>
+          <w:p>
+            <w:pPr>
+              <w:spacing w:after="0"/>
+            </w:pPr>
+            <w:r>
+              <w:rPr>
+                <w:rFonts w:ascii="Malgun Gothic" w:cs="Malgun Gothic" w:eastAsia="Malgun Gothic" w:hAnsi="Malgun Gothic"/>
+                <w:sz w:val="17"/>
+                <w:szCs w:val="17"/>
+              </w:rPr>
+              <w:t xml:space="preserve">67명</w:t>
+            </w:r>
+          </w:p>
+        </w:tc>
+        <w:tc>
+          <w:tcPr>
+            <w:tcW w:type="dxa" w:w="4160"/>
+            <w:tcMar>
+              <w:top w:type="dxa" w:w="60"/>
+              <w:left w:type="dxa" w:w="90"/>
+              <w:bottom w:type="dxa" w:w="60"/>
+              <w:right w:type="dxa" w:w="90"/>
+            </w:tcMar>
+          </w:tcPr>
+          <w:p>
+            <w:pPr>
+              <w:spacing w:after="0"/>
+            </w:pPr>
+            <w:r>
+              <w:rPr>
+                <w:rFonts w:ascii="Malgun Gothic" w:cs="Malgun Gothic" w:eastAsia="Malgun Gothic" w:hAnsi="Malgun Gothic"/>
+                <w:sz w:val="17"/>
+                <w:szCs w:val="17"/>
+              </w:rPr>
+              <w:t xml:space="preserve">용산 2회 이상·1박 이상·누적 20만원 이상. 연락일(10/6·10/7·10/8) 배정, 결과·예약여부 칸 기록</w:t>
+            </w:r>
+          </w:p>
+        </w:tc>
+      </w:tr>
+      <w:tr>
+        <w:trPr>
+          <w:tblHeader w:val="false"/>
+        </w:trPr>
+        <w:tc>
+          <w:tcPr>
+            <w:tcW w:type="dxa" w:w="1352"/>
+            <w:tcMar>
+              <w:top w:type="dxa" w:w="60"/>
+              <w:left w:type="dxa" w:w="90"/>
+              <w:bottom w:type="dxa" w:w="60"/>
+              <w:right w:type="dxa" w:w="90"/>
+            </w:tcMar>
+          </w:tcPr>
+          <w:p>
+            <w:pPr>
+              <w:spacing w:after="0"/>
+            </w:pPr>
+            <w:r>
+              <w:rPr>
+                <w:rFonts w:ascii="Malgun Gothic" w:cs="Malgun Gothic" w:eastAsia="Malgun Gothic" w:hAnsi="Malgun Gothic"/>
+                <w:sz w:val="17"/>
+                <w:szCs w:val="17"/>
+              </w:rPr>
+              <w:t xml:space="preserve">참고_연락스크립트</w:t>
+            </w:r>
+          </w:p>
+        </w:tc>
+        <w:tc>
+          <w:tcPr>
+            <w:tcW w:type="dxa" w:w="3848"/>
+            <w:tcMar>
+              <w:top w:type="dxa" w:w="60"/>
+              <w:left w:type="dxa" w:w="90"/>
+              <w:bottom w:type="dxa" w:w="60"/>
+              <w:right w:type="dxa" w:w="90"/>
+            </w:tcMar>
+          </w:tcPr>
+          <w:p>
+            <w:pPr>
+              <w:spacing w:after="0"/>
+            </w:pPr>
+            <w:r>
+              <w:rPr>
+                <w:rFonts w:ascii="Malgun Gothic" w:cs="Malgun Gothic" w:eastAsia="Malgun Gothic" w:hAnsi="Malgun Gothic"/>
+                <w:sz w:val="17"/>
+                <w:szCs w:val="17"/>
+              </w:rPr>
+              <w:t xml:space="preserve">—</w:t>
+            </w:r>
+          </w:p>
+        </w:tc>
+        <w:tc>
+          <w:tcPr>
+            <w:tcW w:type="dxa" w:w="4160"/>
+            <w:tcMar>
+              <w:top w:type="dxa" w:w="60"/>
+              <w:left w:type="dxa" w:w="90"/>
+              <w:bottom w:type="dxa" w:w="60"/>
+              <w:right w:type="dxa" w:w="90"/>
+            </w:tcMar>
+          </w:tcPr>
+          <w:p>
+            <w:pPr>
+              <w:spacing w:after="0"/>
+            </w:pPr>
+            <w:r>
+              <w:rPr>
+                <w:rFonts w:ascii="Malgun Gothic" w:cs="Malgun Gothic" w:eastAsia="Malgun Gothic" w:hAnsi="Malgun Gothic"/>
+                <w:sz w:val="17"/>
+                <w:szCs w:val="17"/>
+              </w:rPr>
+              <w:t xml:space="preserve">직접 연락 말투</w:t>
+            </w:r>
+          </w:p>
+        </w:tc>
+      </w:tr>
+      <w:tr>
+        <w:trPr>
+          <w:tblHeader w:val="false"/>
+        </w:trPr>
+        <w:tc>
+          <w:tcPr>
+            <w:tcW w:type="dxa" w:w="1352"/>
+            <w:tcMar>
+              <w:top w:type="dxa" w:w="60"/>
+              <w:left w:type="dxa" w:w="90"/>
+              <w:bottom w:type="dxa" w:w="60"/>
+              <w:right w:type="dxa" w:w="90"/>
+            </w:tcMar>
+          </w:tcPr>
+          <w:p>
+            <w:pPr>
+              <w:spacing w:after="0"/>
+            </w:pPr>
+            <w:r>
+              <w:rPr>
+                <w:rFonts w:ascii="Malgun Gothic" w:cs="Malgun Gothic" w:eastAsia="Malgun Gothic" w:hAnsi="Malgun Gothic"/>
+                <w:sz w:val="17"/>
+                <w:szCs w:val="17"/>
+              </w:rPr>
+              <w:t xml:space="preserve">문안</w:t>
+            </w:r>
+          </w:p>
+        </w:tc>
+        <w:tc>
+          <w:tcPr>
+            <w:tcW w:type="dxa" w:w="3848"/>
+            <w:tcMar>
+              <w:top w:type="dxa" w:w="60"/>
+              <w:left w:type="dxa" w:w="90"/>
+              <w:bottom w:type="dxa" w:w="60"/>
+              <w:right w:type="dxa" w:w="90"/>
+            </w:tcMar>
+          </w:tcPr>
+          <w:p>
+            <w:pPr>
+              <w:spacing w:after="0"/>
+            </w:pPr>
+            <w:r>
+              <w:rPr>
+                <w:rFonts w:ascii="Malgun Gothic" w:cs="Malgun Gothic" w:eastAsia="Malgun Gothic" w:hAnsi="Malgun Gothic"/>
+                <w:sz w:val="17"/>
+                <w:szCs w:val="17"/>
+              </w:rPr>
+              <w:t xml:space="preserve">—</w:t>
+            </w:r>
+          </w:p>
+        </w:tc>
+        <w:tc>
+          <w:tcPr>
+            <w:tcW w:type="dxa" w:w="4160"/>
+            <w:tcMar>
+              <w:top w:type="dxa" w:w="60"/>
+              <w:left w:type="dxa" w:w="90"/>
+              <w:bottom w:type="dxa" w:w="60"/>
+              <w:right w:type="dxa" w:w="90"/>
+            </w:tcMar>
+          </w:tcPr>
+          <w:p>
+            <w:pPr>
+              <w:spacing w:after="0"/>
+            </w:pPr>
+            <w:r>
+              <w:rPr>
+                <w:rFonts w:ascii="Malgun Gothic" w:cs="Malgun Gothic" w:eastAsia="Malgun Gothic" w:hAnsi="Malgun Gothic"/>
+                <w:sz w:val="17"/>
+                <w:szCs w:val="17"/>
+              </w:rPr>
+              <w:t xml:space="preserve">1차 392바이트 · 2차 244바이트 (LMS)</w:t>
+            </w:r>
+          </w:p>
+        </w:tc>
+      </w:tr>
+      <w:tr>
+        <w:trPr>
+          <w:tblHeader w:val="false"/>
+        </w:trPr>
+        <w:tc>
+          <w:tcPr>
+            <w:tcW w:type="dxa" w:w="1352"/>
+            <w:tcMar>
+              <w:top w:type="dxa" w:w="60"/>
+              <w:left w:type="dxa" w:w="90"/>
+              <w:bottom w:type="dxa" w:w="60"/>
+              <w:right w:type="dxa" w:w="90"/>
+            </w:tcMar>
+          </w:tcPr>
+          <w:p>
+            <w:pPr>
+              <w:spacing w:after="0"/>
+            </w:pPr>
+            <w:r>
+              <w:rPr>
+                <w:rFonts w:ascii="Malgun Gothic" w:cs="Malgun Gothic" w:eastAsia="Malgun Gothic" w:hAnsi="Malgun Gothic"/>
+                <w:sz w:val="17"/>
+                <w:szCs w:val="17"/>
+              </w:rPr>
+              <w:t xml:space="preserve">9_제외</w:t>
+            </w:r>
+          </w:p>
+        </w:tc>
+        <w:tc>
+          <w:tcPr>
+            <w:tcW w:type="dxa" w:w="3848"/>
+            <w:tcMar>
+              <w:top w:type="dxa" w:w="60"/>
+              <w:left w:type="dxa" w:w="90"/>
+              <w:bottom w:type="dxa" w:w="60"/>
+              <w:right w:type="dxa" w:w="90"/>
+            </w:tcMar>
+          </w:tcPr>
+          <w:p>
+            <w:pPr>
+              <w:spacing w:after="0"/>
+            </w:pPr>
+            <w:r>
+              <w:rPr>
+                <w:rFonts w:ascii="Malgun Gothic" w:cs="Malgun Gothic" w:eastAsia="Malgun Gothic" w:hAnsi="Malgun Gothic"/>
+                <w:sz w:val="17"/>
+                <w:szCs w:val="17"/>
+              </w:rPr>
+              <w:t xml:space="preserve">5명</w:t>
+            </w:r>
+          </w:p>
+        </w:tc>
+        <w:tc>
+          <w:tcPr>
+            <w:tcW w:type="dxa" w:w="4160"/>
+            <w:tcMar>
+              <w:top w:type="dxa" w:w="60"/>
+              <w:left w:type="dxa" w:w="90"/>
+              <w:bottom w:type="dxa" w:w="60"/>
+              <w:right w:type="dxa" w:w="90"/>
+            </w:tcMar>
+          </w:tcPr>
+          <w:p>
+            <w:pPr>
+              <w:spacing w:after="0"/>
+            </w:pPr>
+            <w:r>
+              <w:rPr>
+                <w:rFonts w:ascii="Malgun Gothic" w:cs="Malgun Gothic" w:eastAsia="Malgun Gothic" w:hAnsi="Malgun Gothic"/>
+                <w:sz w:val="17"/>
+                <w:szCs w:val="17"/>
+              </w:rPr>
+              <w:t xml:space="preserve">10/7~10/11 예약 보유 3 · 비회원 2 (광고 미동의 80명은 10/1 명단에서 이미 빠져 있음)</w:t>
+            </w:r>
+          </w:p>
+        </w:tc>
+      </w:tr>
+    </w:tbl>
+    <w:p>
+      <w:pPr>
+        <w:spacing w:after="80"/>
+      </w:pPr>
+    </w:p>
+    <w:p>
+      <w:pPr>
+        <w:pStyle w:val="ListParagraph"/>
+        <w:numPr>
+          <w:ilvl w:val="0"/>
+          <w:numId w:val="2"/>
+        </w:numPr>
+        <w:spacing w:after="50"/>
+      </w:pPr>
+      <w:r>
+        <w:rPr>
+          <w:rFonts w:ascii="Malgun Gothic" w:cs="Malgun Gothic" w:eastAsia="Malgun Gothic" w:hAnsi="Malgun Gothic"/>
+          <w:b/>
+          <w:bCs/>
+          <w:sz w:val="20"/>
+          <w:szCs w:val="20"/>
+        </w:rPr>
+        <w:t xml:space="preserve">2차(10/8 12:00):</w:t>
+      </w:r>
+      <w:r>
+        <w:rPr>
+          <w:rFonts w:ascii="Malgun Gothic" w:cs="Malgun Gothic" w:eastAsia="Malgun Gothic" w:hAnsi="Malgun Gothic"/>
+          <w:sz w:val="20"/>
+          <w:szCs w:val="20"/>
+        </w:rPr>
+        <w:t xml:space="preserve"> 10/8 오전에 최신 결제내역을 넣고 스크립트를 다시 돌리면 1차 이후 예약한 사람이 빠진다. 그 </w:t>
+      </w:r>
+      <w:r>
+        <w:rPr>
+          <w:rFonts w:ascii="Consolas" w:cs="Consolas" w:eastAsia="Consolas" w:hAnsi="Consolas"/>
+          <w:color w:val="7C2D12"/>
+          <w:sz w:val="18"/>
+          <w:szCs w:val="18"/>
+        </w:rPr>
+        <w:t xml:space="preserve">1_문자1차_동의</w:t>
+      </w:r>
+      <w:r>
+        <w:rPr>
+          <w:rFonts w:ascii="Malgun Gothic" w:cs="Malgun Gothic" w:eastAsia="Malgun Gothic" w:hAnsi="Malgun Gothic"/>
+          <w:sz w:val="20"/>
+          <w:szCs w:val="20"/>
+        </w:rPr>
+        <w:t xml:space="preserve"> 시트를 2차 명단으로 쓴다(링크 클릭 여부는 개인별로 알 수 없어 '아직 예약 안 한 사람' 기준).</w:t>
+      </w:r>
+    </w:p>
+    <w:p>
+      <w:pPr>
+        <w:pStyle w:val="ListParagraph"/>
+        <w:numPr>
+          <w:ilvl w:val="0"/>
+          <w:numId w:val="2"/>
+        </w:numPr>
+        <w:spacing w:after="50"/>
+      </w:pPr>
+      <w:r>
+        <w:rPr>
+          <w:rFonts w:ascii="Malgun Gothic" w:cs="Malgun Gothic" w:eastAsia="Malgun Gothic" w:hAnsi="Malgun Gothic"/>
+          <w:b/>
+          <w:bCs/>
+          <w:sz w:val="20"/>
+          <w:szCs w:val="20"/>
+        </w:rPr>
+        <w:t xml:space="preserve">빠져 있는 사람:</w:t>
+      </w:r>
+      <w:r>
+        <w:rPr>
+          <w:rFonts w:ascii="Malgun Gothic" w:cs="Malgun Gothic" w:eastAsia="Malgun Gothic" w:hAnsi="Malgun Gothic"/>
+          <w:sz w:val="20"/>
+          <w:szCs w:val="20"/>
+        </w:rPr>
+        <w:t xml:space="preserve"> 9/30 이후 가입자는 이 명단에 없다. 최신 회원 설문 내보내기를 주면 추가한다.</w:t>
+      </w:r>
+    </w:p>
+    <w:p>
+      <w:pPr>
+        <w:pStyle w:val="ListParagraph"/>
+        <w:numPr>
+          <w:ilvl w:val="0"/>
+          <w:numId w:val="2"/>
+        </w:numPr>
+        <w:spacing w:after="50"/>
+      </w:pPr>
+      <w:r>
+        <w:rPr>
+          <w:rFonts w:ascii="Malgun Gothic" w:cs="Malgun Gothic" w:eastAsia="Malgun Gothic" w:hAnsi="Malgun Gothic"/>
+          <w:sz w:val="20"/>
+          <w:szCs w:val="20"/>
+        </w:rPr>
+        <w:t xml:space="preserve">문안의 </w:t>
+      </w:r>
+      <w:r>
+        <w:rPr>
+          <w:rFonts w:ascii="Consolas" w:cs="Consolas" w:eastAsia="Consolas" w:hAnsi="Consolas"/>
+          <w:color w:val="7C2D12"/>
+          <w:sz w:val="18"/>
+          <w:szCs w:val="18"/>
+        </w:rPr>
+        <w:t xml:space="preserve">{전용 링크}</w:t>
+      </w:r>
+      <w:r>
+        <w:rPr>
+          <w:rFonts w:ascii="Malgun Gothic" w:cs="Malgun Gothic" w:eastAsia="Malgun Gothic" w:hAnsi="Malgun Gothic"/>
+          <w:sz w:val="20"/>
+          <w:szCs w:val="20"/>
+        </w:rPr>
+        <w:t xml:space="preserve">는 할인 등록 후 받은 실제 링크로 바꾼다.</w:t>
+      </w:r>
+    </w:p>
+    <w:p>
+      <w:pPr>
+        <w:pStyle w:val="Heading1"/>
+        <w:spacing w:after="140" w:before="320"/>
+      </w:pPr>
+      <w:r>
+        <w:rPr>
+          <w:rFonts w:ascii="Malgun Gothic" w:cs="Malgun Gothic" w:eastAsia="Malgun Gothic" w:hAnsi="Malgun Gothic"/>
+          <w:b/>
+          <w:bCs/>
+          <w:color w:val="1C1917"/>
+          <w:sz w:val="28"/>
+          <w:szCs w:val="28"/>
+        </w:rPr>
+        <w:t xml:space="preserve">5. 문자 문안</w:t>
       </w:r>
     </w:p>
     <w:p>
@@ -7433,7 +8283,7 @@
           <w:sz w:val="28"/>
           <w:szCs w:val="28"/>
         </w:rPr>
-        <w:t xml:space="preserve">5. 광고 최소안 (오퍼에 맞춰 수정)</w:t>
+        <w:t xml:space="preserve">6. 광고 최소안 (오퍼에 맞춰 수정)</w:t>
       </w:r>
     </w:p>
     <w:tbl>
@@ -8136,7 +8986,7 @@
           <w:sz w:val="28"/>
           <w:szCs w:val="28"/>
         </w:rPr>
-        <w:t xml:space="preserve">6. 매일 볼 숫자</w:t>
+        <w:t xml:space="preserve">7. 매일 볼 숫자</w:t>
       </w:r>
     </w:p>
     <w:tbl>

</xml_diff>

<commit_message>
Send list: add Oct 1-6 consented signups from latest member export and refresh consent status
Co-Authored-By: Claude Opus 5.5 <noreply@anthropic.com>
Claude-Session: https://claude.ai/code/session_01MNAKb9sccB4tN87nMGAtUU
</commit_message>
<xml_diff>
--- a/crm/output/용산_한글날_시승오퍼_실행계획_1006-1009.docx
+++ b/crm/output/용산_한글날_시승오퍼_실행계획_1006-1009.docx
@@ -5042,7 +5042,7 @@
                 <w:sz w:val="17"/>
                 <w:szCs w:val="17"/>
               </w:rPr>
-              <w:t xml:space="preserve"> 발송: 동의 760명 (거래고객·수강생 91 + 신규 동의 669) — 4절 명단</w:t>
+              <w:t xml:space="preserve"> 발송: 동의 849명 (거래고객·수강생 92 + 9월 신규 동의 665 + 10월 신규 동의 92) — 4절 명단</w:t>
             </w:r>
           </w:p>
         </w:tc>
@@ -5589,7 +5589,7 @@
           <w:sz w:val="20"/>
           <w:szCs w:val="20"/>
         </w:rPr>
-        <w:t xml:space="preserve"> 연휴 3일 확보 대여 시간 ≥ 120시간(24시간 기준 약 8%). 미달이면 문자 2차 대상에 마케팅 수신 미응답 거래고객 56명(</w:t>
+        <w:t xml:space="preserve"> 연휴 3일 확보 대여 시간 ≥ 120시간(24시간 기준 약 8%). 미달이면 문자 2차 대상에 마케팅 수신 미응답 거래고객 55명(</w:t>
       </w:r>
       <w:r>
         <w:rPr>
@@ -7161,9 +7161,9 @@
         </w:tblBorders>
       </w:tblPr>
       <w:tblGrid>
-        <w:gridCol w:w="1352"/>
-        <w:gridCol w:w="3848"/>
-        <w:gridCol w:w="4160"/>
+        <w:gridCol w:w="1308"/>
+        <w:gridCol w:w="4026"/>
+        <w:gridCol w:w="4026"/>
       </w:tblGrid>
       <w:tr>
         <w:trPr>
@@ -7171,7 +7171,7 @@
         </w:trPr>
         <w:tc>
           <w:tcPr>
-            <w:tcW w:type="dxa" w:w="1352"/>
+            <w:tcW w:type="dxa" w:w="1308"/>
             <w:shd w:fill="1C1917" w:color="auto" w:val="clear"/>
             <w:tcMar>
               <w:top w:type="dxa" w:w="60"/>
@@ -7199,7 +7199,7 @@
         </w:tc>
         <w:tc>
           <w:tcPr>
-            <w:tcW w:type="dxa" w:w="3848"/>
+            <w:tcW w:type="dxa" w:w="4026"/>
             <w:shd w:fill="1C1917" w:color="auto" w:val="clear"/>
             <w:tcMar>
               <w:top w:type="dxa" w:w="60"/>
@@ -7227,7 +7227,7 @@
         </w:tc>
         <w:tc>
           <w:tcPr>
-            <w:tcW w:type="dxa" w:w="4160"/>
+            <w:tcW w:type="dxa" w:w="4026"/>
             <w:shd w:fill="1C1917" w:color="auto" w:val="clear"/>
             <w:tcMar>
               <w:top w:type="dxa" w:w="60"/>
@@ -7260,7 +7260,7 @@
         </w:trPr>
         <w:tc>
           <w:tcPr>
-            <w:tcW w:type="dxa" w:w="1352"/>
+            <w:tcW w:type="dxa" w:w="1308"/>
             <w:tcMar>
               <w:top w:type="dxa" w:w="60"/>
               <w:left w:type="dxa" w:w="90"/>
@@ -7284,7 +7284,7 @@
         </w:tc>
         <w:tc>
           <w:tcPr>
-            <w:tcW w:type="dxa" w:w="3848"/>
+            <w:tcW w:type="dxa" w:w="4026"/>
             <w:tcMar>
               <w:top w:type="dxa" w:w="60"/>
               <w:left w:type="dxa" w:w="90"/>
@@ -7304,21 +7304,21 @@
                 <w:sz w:val="17"/>
                 <w:szCs w:val="17"/>
               </w:rPr>
-              <w:t xml:space="preserve">760명</w:t>
-            </w:r>
-            <w:r>
-              <w:rPr>
-                <w:rFonts w:ascii="Malgun Gothic" w:cs="Malgun Gothic" w:eastAsia="Malgun Gothic" w:hAnsi="Malgun Gothic"/>
-                <w:sz w:val="17"/>
-                <w:szCs w:val="17"/>
-              </w:rPr>
-              <w:t xml:space="preserve"> (거래고객·수강생 91 + 9월 신규 동의 669)</w:t>
-            </w:r>
-          </w:p>
-        </w:tc>
-        <w:tc>
-          <w:tcPr>
-            <w:tcW w:type="dxa" w:w="4160"/>
+              <w:t xml:space="preserve">849명</w:t>
+            </w:r>
+            <w:r>
+              <w:rPr>
+                <w:rFonts w:ascii="Malgun Gothic" w:cs="Malgun Gothic" w:eastAsia="Malgun Gothic" w:hAnsi="Malgun Gothic"/>
+                <w:sz w:val="17"/>
+                <w:szCs w:val="17"/>
+              </w:rPr>
+              <w:t xml:space="preserve"> (거래고객·수강생 92 + 9월 신규 동의 665 + 10/1~10/6 신규 동의 92)</w:t>
+            </w:r>
+          </w:p>
+        </w:tc>
+        <w:tc>
+          <w:tcPr>
+            <w:tcW w:type="dxa" w:w="4026"/>
             <w:tcMar>
               <w:top w:type="dxa" w:w="60"/>
               <w:left w:type="dxa" w:w="90"/>
@@ -7347,7 +7347,7 @@
         </w:trPr>
         <w:tc>
           <w:tcPr>
-            <w:tcW w:type="dxa" w:w="1352"/>
+            <w:tcW w:type="dxa" w:w="1308"/>
             <w:tcMar>
               <w:top w:type="dxa" w:w="60"/>
               <w:left w:type="dxa" w:w="90"/>
@@ -7371,31 +7371,31 @@
         </w:tc>
         <w:tc>
           <w:tcPr>
-            <w:tcW w:type="dxa" w:w="3848"/>
-            <w:tcMar>
-              <w:top w:type="dxa" w:w="60"/>
-              <w:left w:type="dxa" w:w="90"/>
-              <w:bottom w:type="dxa" w:w="60"/>
-              <w:right w:type="dxa" w:w="90"/>
-            </w:tcMar>
-          </w:tcPr>
-          <w:p>
-            <w:pPr>
-              <w:spacing w:after="0"/>
-            </w:pPr>
-            <w:r>
-              <w:rPr>
-                <w:rFonts w:ascii="Malgun Gothic" w:cs="Malgun Gothic" w:eastAsia="Malgun Gothic" w:hAnsi="Malgun Gothic"/>
-                <w:sz w:val="17"/>
-                <w:szCs w:val="17"/>
-              </w:rPr>
-              <w:t xml:space="preserve">56명</w:t>
-            </w:r>
-          </w:p>
-        </w:tc>
-        <w:tc>
-          <w:tcPr>
-            <w:tcW w:type="dxa" w:w="4160"/>
+            <w:tcW w:type="dxa" w:w="4026"/>
+            <w:tcMar>
+              <w:top w:type="dxa" w:w="60"/>
+              <w:left w:type="dxa" w:w="90"/>
+              <w:bottom w:type="dxa" w:w="60"/>
+              <w:right w:type="dxa" w:w="90"/>
+            </w:tcMar>
+          </w:tcPr>
+          <w:p>
+            <w:pPr>
+              <w:spacing w:after="0"/>
+            </w:pPr>
+            <w:r>
+              <w:rPr>
+                <w:rFonts w:ascii="Malgun Gothic" w:cs="Malgun Gothic" w:eastAsia="Malgun Gothic" w:hAnsi="Malgun Gothic"/>
+                <w:sz w:val="17"/>
+                <w:szCs w:val="17"/>
+              </w:rPr>
+              <w:t xml:space="preserve">55명</w:t>
+            </w:r>
+          </w:p>
+        </w:tc>
+        <w:tc>
+          <w:tcPr>
+            <w:tcW w:type="dxa" w:w="4026"/>
             <w:tcMar>
               <w:top w:type="dxa" w:w="60"/>
               <w:left w:type="dxa" w:w="90"/>
@@ -7424,7 +7424,7 @@
         </w:trPr>
         <w:tc>
           <w:tcPr>
-            <w:tcW w:type="dxa" w:w="1352"/>
+            <w:tcW w:type="dxa" w:w="1308"/>
             <w:tcMar>
               <w:top w:type="dxa" w:w="60"/>
               <w:left w:type="dxa" w:w="90"/>
@@ -7448,7 +7448,7 @@
         </w:tc>
         <w:tc>
           <w:tcPr>
-            <w:tcW w:type="dxa" w:w="3848"/>
+            <w:tcW w:type="dxa" w:w="4026"/>
             <w:tcMar>
               <w:top w:type="dxa" w:w="60"/>
               <w:left w:type="dxa" w:w="90"/>
@@ -7472,7 +7472,7 @@
         </w:tc>
         <w:tc>
           <w:tcPr>
-            <w:tcW w:type="dxa" w:w="4160"/>
+            <w:tcW w:type="dxa" w:w="4026"/>
             <w:tcMar>
               <w:top w:type="dxa" w:w="60"/>
               <w:left w:type="dxa" w:w="90"/>
@@ -7501,7 +7501,7 @@
         </w:trPr>
         <w:tc>
           <w:tcPr>
-            <w:tcW w:type="dxa" w:w="1352"/>
+            <w:tcW w:type="dxa" w:w="1308"/>
             <w:tcMar>
               <w:top w:type="dxa" w:w="60"/>
               <w:left w:type="dxa" w:w="90"/>
@@ -7525,7 +7525,7 @@
         </w:tc>
         <w:tc>
           <w:tcPr>
-            <w:tcW w:type="dxa" w:w="3848"/>
+            <w:tcW w:type="dxa" w:w="4026"/>
             <w:tcMar>
               <w:top w:type="dxa" w:w="60"/>
               <w:left w:type="dxa" w:w="90"/>
@@ -7549,7 +7549,7 @@
         </w:tc>
         <w:tc>
           <w:tcPr>
-            <w:tcW w:type="dxa" w:w="4160"/>
+            <w:tcW w:type="dxa" w:w="4026"/>
             <w:tcMar>
               <w:top w:type="dxa" w:w="60"/>
               <w:left w:type="dxa" w:w="90"/>
@@ -7578,7 +7578,7 @@
         </w:trPr>
         <w:tc>
           <w:tcPr>
-            <w:tcW w:type="dxa" w:w="1352"/>
+            <w:tcW w:type="dxa" w:w="1308"/>
             <w:tcMar>
               <w:top w:type="dxa" w:w="60"/>
               <w:left w:type="dxa" w:w="90"/>
@@ -7602,7 +7602,7 @@
         </w:tc>
         <w:tc>
           <w:tcPr>
-            <w:tcW w:type="dxa" w:w="3848"/>
+            <w:tcW w:type="dxa" w:w="4026"/>
             <w:tcMar>
               <w:top w:type="dxa" w:w="60"/>
               <w:left w:type="dxa" w:w="90"/>
@@ -7626,7 +7626,7 @@
         </w:tc>
         <w:tc>
           <w:tcPr>
-            <w:tcW w:type="dxa" w:w="4160"/>
+            <w:tcW w:type="dxa" w:w="4026"/>
             <w:tcMar>
               <w:top w:type="dxa" w:w="60"/>
               <w:left w:type="dxa" w:w="90"/>
@@ -7655,7 +7655,84 @@
         </w:trPr>
         <w:tc>
           <w:tcPr>
-            <w:tcW w:type="dxa" w:w="1352"/>
+            <w:tcW w:type="dxa" w:w="1308"/>
+            <w:tcMar>
+              <w:top w:type="dxa" w:w="60"/>
+              <w:left w:type="dxa" w:w="90"/>
+              <w:bottom w:type="dxa" w:w="60"/>
+              <w:right w:type="dxa" w:w="90"/>
+            </w:tcMar>
+          </w:tcPr>
+          <w:p>
+            <w:pPr>
+              <w:spacing w:after="0"/>
+            </w:pPr>
+            <w:r>
+              <w:rPr>
+                <w:rFonts w:ascii="Malgun Gothic" w:cs="Malgun Gothic" w:eastAsia="Malgun Gothic" w:hAnsi="Malgun Gothic"/>
+                <w:sz w:val="17"/>
+                <w:szCs w:val="17"/>
+              </w:rPr>
+              <w:t xml:space="preserve">3_선택_이전동의회원</w:t>
+            </w:r>
+          </w:p>
+        </w:tc>
+        <w:tc>
+          <w:tcPr>
+            <w:tcW w:type="dxa" w:w="4026"/>
+            <w:tcMar>
+              <w:top w:type="dxa" w:w="60"/>
+              <w:left w:type="dxa" w:w="90"/>
+              <w:bottom w:type="dxa" w:w="60"/>
+              <w:right w:type="dxa" w:w="90"/>
+            </w:tcMar>
+          </w:tcPr>
+          <w:p>
+            <w:pPr>
+              <w:spacing w:after="0"/>
+            </w:pPr>
+            <w:r>
+              <w:rPr>
+                <w:rFonts w:ascii="Malgun Gothic" w:cs="Malgun Gothic" w:eastAsia="Malgun Gothic" w:hAnsi="Malgun Gothic"/>
+                <w:sz w:val="17"/>
+                <w:szCs w:val="17"/>
+              </w:rPr>
+              <w:t xml:space="preserve">548명</w:t>
+            </w:r>
+          </w:p>
+        </w:tc>
+        <w:tc>
+          <w:tcPr>
+            <w:tcW w:type="dxa" w:w="4026"/>
+            <w:tcMar>
+              <w:top w:type="dxa" w:w="60"/>
+              <w:left w:type="dxa" w:w="90"/>
+              <w:bottom w:type="dxa" w:w="60"/>
+              <w:right w:type="dxa" w:w="90"/>
+            </w:tcMar>
+          </w:tcPr>
+          <w:p>
+            <w:pPr>
+              <w:spacing w:after="0"/>
+            </w:pPr>
+            <w:r>
+              <w:rPr>
+                <w:rFonts w:ascii="Malgun Gothic" w:cs="Malgun Gothic" w:eastAsia="Malgun Gothic" w:hAnsi="Malgun Gothic"/>
+                <w:sz w:val="17"/>
+                <w:szCs w:val="17"/>
+              </w:rPr>
+              <w:t xml:space="preserve">8월 이전 가입한 동의 회원(9/4 회차 등에서 받은 사람). 넓게 보내려면 포함. 휴면 전환율은 낮다(2.5%)</w:t>
+            </w:r>
+          </w:p>
+        </w:tc>
+      </w:tr>
+      <w:tr>
+        <w:trPr>
+          <w:tblHeader w:val="false"/>
+        </w:trPr>
+        <w:tc>
+          <w:tcPr>
+            <w:tcW w:type="dxa" w:w="1308"/>
             <w:tcMar>
               <w:top w:type="dxa" w:w="60"/>
               <w:left w:type="dxa" w:w="90"/>
@@ -7679,49 +7756,49 @@
         </w:tc>
         <w:tc>
           <w:tcPr>
-            <w:tcW w:type="dxa" w:w="3848"/>
-            <w:tcMar>
-              <w:top w:type="dxa" w:w="60"/>
-              <w:left w:type="dxa" w:w="90"/>
-              <w:bottom w:type="dxa" w:w="60"/>
-              <w:right w:type="dxa" w:w="90"/>
-            </w:tcMar>
-          </w:tcPr>
-          <w:p>
-            <w:pPr>
-              <w:spacing w:after="0"/>
-            </w:pPr>
-            <w:r>
-              <w:rPr>
-                <w:rFonts w:ascii="Malgun Gothic" w:cs="Malgun Gothic" w:eastAsia="Malgun Gothic" w:hAnsi="Malgun Gothic"/>
-                <w:sz w:val="17"/>
-                <w:szCs w:val="17"/>
-              </w:rPr>
-              <w:t xml:space="preserve">5명</w:t>
-            </w:r>
-          </w:p>
-        </w:tc>
-        <w:tc>
-          <w:tcPr>
-            <w:tcW w:type="dxa" w:w="4160"/>
-            <w:tcMar>
-              <w:top w:type="dxa" w:w="60"/>
-              <w:left w:type="dxa" w:w="90"/>
-              <w:bottom w:type="dxa" w:w="60"/>
-              <w:right w:type="dxa" w:w="90"/>
-            </w:tcMar>
-          </w:tcPr>
-          <w:p>
-            <w:pPr>
-              <w:spacing w:after="0"/>
-            </w:pPr>
-            <w:r>
-              <w:rPr>
-                <w:rFonts w:ascii="Malgun Gothic" w:cs="Malgun Gothic" w:eastAsia="Malgun Gothic" w:hAnsi="Malgun Gothic"/>
-                <w:sz w:val="17"/>
-                <w:szCs w:val="17"/>
-              </w:rPr>
-              <w:t xml:space="preserve">10/7~10/11 예약 보유 3 · 비회원 2 (광고 미동의 80명은 10/1 명단에서 이미 빠져 있음)</w:t>
+            <w:tcW w:type="dxa" w:w="4026"/>
+            <w:tcMar>
+              <w:top w:type="dxa" w:w="60"/>
+              <w:left w:type="dxa" w:w="90"/>
+              <w:bottom w:type="dxa" w:w="60"/>
+              <w:right w:type="dxa" w:w="90"/>
+            </w:tcMar>
+          </w:tcPr>
+          <w:p>
+            <w:pPr>
+              <w:spacing w:after="0"/>
+            </w:pPr>
+            <w:r>
+              <w:rPr>
+                <w:rFonts w:ascii="Malgun Gothic" w:cs="Malgun Gothic" w:eastAsia="Malgun Gothic" w:hAnsi="Malgun Gothic"/>
+                <w:sz w:val="17"/>
+                <w:szCs w:val="17"/>
+              </w:rPr>
+              <w:t xml:space="preserve">14명</w:t>
+            </w:r>
+          </w:p>
+        </w:tc>
+        <w:tc>
+          <w:tcPr>
+            <w:tcW w:type="dxa" w:w="4026"/>
+            <w:tcMar>
+              <w:top w:type="dxa" w:w="60"/>
+              <w:left w:type="dxa" w:w="90"/>
+              <w:bottom w:type="dxa" w:w="60"/>
+              <w:right w:type="dxa" w:w="90"/>
+            </w:tcMar>
+          </w:tcPr>
+          <w:p>
+            <w:pPr>
+              <w:spacing w:after="0"/>
+            </w:pPr>
+            <w:r>
+              <w:rPr>
+                <w:rFonts w:ascii="Malgun Gothic" w:cs="Malgun Gothic" w:eastAsia="Malgun Gothic" w:hAnsi="Malgun Gothic"/>
+                <w:sz w:val="17"/>
+                <w:szCs w:val="17"/>
+              </w:rPr>
+              <w:t xml:space="preserve">다른 지점(분당·진주·대구·제주)만 이용 10 · 비회원 2 · 10/7~10/11 예약 보유 2 (광고 미동의 80명은 10/1 명단에서 이미 빠짐)</w:t>
             </w:r>
           </w:p>
         </w:tc>
@@ -7794,7 +7871,7 @@
           <w:sz w:val="20"/>
           <w:szCs w:val="20"/>
         </w:rPr>
-        <w:t xml:space="preserve">빠져 있는 사람:</w:t>
+        <w:t xml:space="preserve">회원 기준:</w:t>
       </w:r>
       <w:r>
         <w:rPr>
@@ -7802,7 +7879,24 @@
           <w:sz w:val="20"/>
           <w:szCs w:val="20"/>
         </w:rPr>
-        <w:t xml:space="preserve"> 9/30 이후 가입자는 이 명단에 없다. 최신 회원 설문 내보내기를 주면 추가한다.</w:t>
+        <w:t xml:space="preserve"> </w:t>
+      </w:r>
+      <w:r>
+        <w:rPr>
+          <w:rFonts w:ascii="Consolas" w:cs="Consolas" w:eastAsia="Consolas" w:hAnsi="Consolas"/>
+          <w:color w:val="7C2D12"/>
+          <w:sz w:val="18"/>
+          <w:szCs w:val="18"/>
+        </w:rPr>
+        <w:t xml:space="preserve">회원설문_2026-10-06_전체.xlsx</w:t>
+      </w:r>
+      <w:r>
+        <w:rPr>
+          <w:rFonts w:ascii="Malgun Gothic" w:cs="Malgun Gothic" w:eastAsia="Malgun Gothic" w:hAnsi="Malgun Gothic"/>
+          <w:sz w:val="20"/>
+          <w:szCs w:val="20"/>
+        </w:rPr>
+        <w:t xml:space="preserve">(9,190명)로 10/1~10/6 가입 동의자를 더하고, 모든 대상의 수신동의 상태를 현재 값으로 갱신했다(미응답 → 동의 1명 이동). 발송 직전 최신 회원 설문을 넣고 다시 돌리면 새 가입자·수신거부가 반영된다.</w:t>
       </w:r>
     </w:p>
     <w:p>

</xml_diff>

<commit_message>
Send list: include all consented and unasked members; add manager notice for the Hangul Day offer
Co-Authored-By: Claude Opus 5.5 <noreply@anthropic.com>
Claude-Session: https://claude.ai/code/session_01MNAKb9sccB4tN87nMGAtUU
</commit_message>
<xml_diff>
--- a/crm/output/용산_한글날_시승오퍼_실행계획_1006-1009.docx
+++ b/crm/output/용산_한글날_시승오퍼_실행계획_1006-1009.docx
@@ -3395,9 +3395,9 @@
         </w:tblBorders>
       </w:tblPr>
       <w:tblGrid>
-        <w:gridCol w:w="4030"/>
-        <w:gridCol w:w="1560"/>
-        <w:gridCol w:w="3770"/>
+        <w:gridCol w:w="2693"/>
+        <w:gridCol w:w="1539"/>
+        <w:gridCol w:w="5129"/>
       </w:tblGrid>
       <w:tr>
         <w:trPr>
@@ -3405,7 +3405,7 @@
         </w:trPr>
         <w:tc>
           <w:tcPr>
-            <w:tcW w:type="dxa" w:w="4030"/>
+            <w:tcW w:type="dxa" w:w="2693"/>
             <w:shd w:fill="1C1917" w:color="auto" w:val="clear"/>
             <w:tcMar>
               <w:top w:type="dxa" w:w="60"/>
@@ -3433,7 +3433,7 @@
         </w:tc>
         <w:tc>
           <w:tcPr>
-            <w:tcW w:type="dxa" w:w="1560"/>
+            <w:tcW w:type="dxa" w:w="1539"/>
             <w:shd w:fill="1C1917" w:color="auto" w:val="clear"/>
             <w:tcMar>
               <w:top w:type="dxa" w:w="60"/>
@@ -3461,7 +3461,7 @@
         </w:tc>
         <w:tc>
           <w:tcPr>
-            <w:tcW w:type="dxa" w:w="3770"/>
+            <w:tcW w:type="dxa" w:w="5129"/>
             <w:shd w:fill="1C1917" w:color="auto" w:val="clear"/>
             <w:tcMar>
               <w:top w:type="dxa" w:w="60"/>
@@ -3494,31 +3494,31 @@
         </w:trPr>
         <w:tc>
           <w:tcPr>
-            <w:tcW w:type="dxa" w:w="4030"/>
-            <w:tcMar>
-              <w:top w:type="dxa" w:w="60"/>
-              <w:left w:type="dxa" w:w="90"/>
-              <w:bottom w:type="dxa" w:w="60"/>
-              <w:right w:type="dxa" w:w="90"/>
-            </w:tcMar>
-          </w:tcPr>
-          <w:p>
-            <w:pPr>
-              <w:spacing w:after="0"/>
-            </w:pPr>
-            <w:r>
-              <w:rPr>
-                <w:rFonts w:ascii="Malgun Gothic" w:cs="Malgun Gothic" w:eastAsia="Malgun Gothic" w:hAnsi="Malgun Gothic"/>
-                <w:sz w:val="17"/>
-                <w:szCs w:val="17"/>
-              </w:rPr>
-              <w:t xml:space="preserve">회원 문자 2회 (거래 132명 + 동의 신규 671명)</w:t>
-            </w:r>
-          </w:p>
-        </w:tc>
-        <w:tc>
-          <w:tcPr>
-            <w:tcW w:type="dxa" w:w="1560"/>
+            <w:tcW w:type="dxa" w:w="2693"/>
+            <w:tcMar>
+              <w:top w:type="dxa" w:w="60"/>
+              <w:left w:type="dxa" w:w="90"/>
+              <w:bottom w:type="dxa" w:w="60"/>
+              <w:right w:type="dxa" w:w="90"/>
+            </w:tcMar>
+          </w:tcPr>
+          <w:p>
+            <w:pPr>
+              <w:spacing w:after="0"/>
+            </w:pPr>
+            <w:r>
+              <w:rPr>
+                <w:rFonts w:ascii="Malgun Gothic" w:cs="Malgun Gothic" w:eastAsia="Malgun Gothic" w:hAnsi="Malgun Gothic"/>
+                <w:sz w:val="17"/>
+                <w:szCs w:val="17"/>
+              </w:rPr>
+              <w:t xml:space="preserve">회원 문자 2회 (1,427명)</w:t>
+            </w:r>
+          </w:p>
+        </w:tc>
+        <w:tc>
+          <w:tcPr>
+            <w:tcW w:type="dxa" w:w="1539"/>
             <w:tcMar>
               <w:top w:type="dxa" w:w="60"/>
               <w:left w:type="dxa" w:w="90"/>
@@ -3542,25 +3542,25 @@
         </w:tc>
         <w:tc>
           <w:tcPr>
-            <w:tcW w:type="dxa" w:w="3770"/>
-            <w:tcMar>
-              <w:top w:type="dxa" w:w="60"/>
-              <w:left w:type="dxa" w:w="90"/>
-              <w:bottom w:type="dxa" w:w="60"/>
-              <w:right w:type="dxa" w:w="90"/>
-            </w:tcMar>
-          </w:tcPr>
-          <w:p>
-            <w:pPr>
-              <w:spacing w:after="0"/>
-            </w:pPr>
-            <w:r>
-              <w:rPr>
-                <w:rFonts w:ascii="Malgun Gothic" w:cs="Malgun Gothic" w:eastAsia="Malgun Gothic" w:hAnsi="Malgun Gothic"/>
-                <w:sz w:val="17"/>
-                <w:szCs w:val="17"/>
-              </w:rPr>
-              <w:t xml:space="preserve">약 80만</w:t>
+            <w:tcW w:type="dxa" w:w="5129"/>
+            <w:tcMar>
+              <w:top w:type="dxa" w:w="60"/>
+              <w:left w:type="dxa" w:w="90"/>
+              <w:bottom w:type="dxa" w:w="60"/>
+              <w:right w:type="dxa" w:w="90"/>
+            </w:tcMar>
+          </w:tcPr>
+          <w:p>
+            <w:pPr>
+              <w:spacing w:after="0"/>
+            </w:pPr>
+            <w:r>
+              <w:rPr>
+                <w:rFonts w:ascii="Malgun Gothic" w:cs="Malgun Gothic" w:eastAsia="Malgun Gothic" w:hAnsi="Malgun Gothic"/>
+                <w:sz w:val="17"/>
+                <w:szCs w:val="17"/>
+              </w:rPr>
+              <w:t xml:space="preserve">약 80만 (이전 가입 동의 523명 추가분 +10~25만은 예상치에 넣지 않음)</w:t>
             </w:r>
           </w:p>
         </w:tc>
@@ -3571,7 +3571,7 @@
         </w:trPr>
         <w:tc>
           <w:tcPr>
-            <w:tcW w:type="dxa" w:w="4030"/>
+            <w:tcW w:type="dxa" w:w="2693"/>
             <w:tcMar>
               <w:top w:type="dxa" w:w="60"/>
               <w:left w:type="dxa" w:w="90"/>
@@ -3595,7 +3595,7 @@
         </w:tc>
         <w:tc>
           <w:tcPr>
-            <w:tcW w:type="dxa" w:w="1560"/>
+            <w:tcW w:type="dxa" w:w="1539"/>
             <w:tcMar>
               <w:top w:type="dxa" w:w="60"/>
               <w:left w:type="dxa" w:w="90"/>
@@ -3619,7 +3619,7 @@
         </w:tc>
         <w:tc>
           <w:tcPr>
-            <w:tcW w:type="dxa" w:w="3770"/>
+            <w:tcW w:type="dxa" w:w="5129"/>
             <w:tcMar>
               <w:top w:type="dxa" w:w="60"/>
               <w:left w:type="dxa" w:w="90"/>
@@ -3648,7 +3648,7 @@
         </w:trPr>
         <w:tc>
           <w:tcPr>
-            <w:tcW w:type="dxa" w:w="4030"/>
+            <w:tcW w:type="dxa" w:w="2693"/>
             <w:tcMar>
               <w:top w:type="dxa" w:w="60"/>
               <w:left w:type="dxa" w:w="90"/>
@@ -3672,7 +3672,7 @@
         </w:tc>
         <w:tc>
           <w:tcPr>
-            <w:tcW w:type="dxa" w:w="1560"/>
+            <w:tcW w:type="dxa" w:w="1539"/>
             <w:tcMar>
               <w:top w:type="dxa" w:w="60"/>
               <w:left w:type="dxa" w:w="90"/>
@@ -3696,7 +3696,7 @@
         </w:tc>
         <w:tc>
           <w:tcPr>
-            <w:tcW w:type="dxa" w:w="3770"/>
+            <w:tcW w:type="dxa" w:w="5129"/>
             <w:tcMar>
               <w:top w:type="dxa" w:w="60"/>
               <w:left w:type="dxa" w:w="90"/>
@@ -3725,7 +3725,7 @@
         </w:trPr>
         <w:tc>
           <w:tcPr>
-            <w:tcW w:type="dxa" w:w="4030"/>
+            <w:tcW w:type="dxa" w:w="2693"/>
             <w:tcMar>
               <w:top w:type="dxa" w:w="60"/>
               <w:left w:type="dxa" w:w="90"/>
@@ -3749,7 +3749,7 @@
         </w:tc>
         <w:tc>
           <w:tcPr>
-            <w:tcW w:type="dxa" w:w="1560"/>
+            <w:tcW w:type="dxa" w:w="1539"/>
             <w:tcMar>
               <w:top w:type="dxa" w:w="60"/>
               <w:left w:type="dxa" w:w="90"/>
@@ -3773,7 +3773,7 @@
         </w:tc>
         <w:tc>
           <w:tcPr>
-            <w:tcW w:type="dxa" w:w="3770"/>
+            <w:tcW w:type="dxa" w:w="5129"/>
             <w:tcMar>
               <w:top w:type="dxa" w:w="60"/>
               <w:left w:type="dxa" w:w="90"/>
@@ -3802,7 +3802,7 @@
         </w:trPr>
         <w:tc>
           <w:tcPr>
-            <w:tcW w:type="dxa" w:w="4030"/>
+            <w:tcW w:type="dxa" w:w="2693"/>
             <w:tcMar>
               <w:top w:type="dxa" w:w="60"/>
               <w:left w:type="dxa" w:w="90"/>
@@ -3835,7 +3835,7 @@
         </w:tc>
         <w:tc>
           <w:tcPr>
-            <w:tcW w:type="dxa" w:w="1560"/>
+            <w:tcW w:type="dxa" w:w="1539"/>
             <w:tcMar>
               <w:top w:type="dxa" w:w="60"/>
               <w:left w:type="dxa" w:w="90"/>
@@ -3859,7 +3859,7 @@
         </w:tc>
         <w:tc>
           <w:tcPr>
-            <w:tcW w:type="dxa" w:w="3770"/>
+            <w:tcW w:type="dxa" w:w="5129"/>
             <w:tcMar>
               <w:top w:type="dxa" w:w="60"/>
               <w:left w:type="dxa" w:w="90"/>
@@ -3888,7 +3888,7 @@
         </w:trPr>
         <w:tc>
           <w:tcPr>
-            <w:tcW w:type="dxa" w:w="4030"/>
+            <w:tcW w:type="dxa" w:w="2693"/>
             <w:tcMar>
               <w:top w:type="dxa" w:w="60"/>
               <w:left w:type="dxa" w:w="90"/>
@@ -3912,7 +3912,7 @@
         </w:tc>
         <w:tc>
           <w:tcPr>
-            <w:tcW w:type="dxa" w:w="1560"/>
+            <w:tcW w:type="dxa" w:w="1539"/>
             <w:tcMar>
               <w:top w:type="dxa" w:w="60"/>
               <w:left w:type="dxa" w:w="90"/>
@@ -3936,7 +3936,7 @@
         </w:tc>
         <w:tc>
           <w:tcPr>
-            <w:tcW w:type="dxa" w:w="3770"/>
+            <w:tcW w:type="dxa" w:w="5129"/>
             <w:tcMar>
               <w:top w:type="dxa" w:w="60"/>
               <w:left w:type="dxa" w:w="90"/>
@@ -3965,7 +3965,7 @@
         </w:trPr>
         <w:tc>
           <w:tcPr>
-            <w:tcW w:type="dxa" w:w="4030"/>
+            <w:tcW w:type="dxa" w:w="2693"/>
             <w:tcMar>
               <w:top w:type="dxa" w:w="60"/>
               <w:left w:type="dxa" w:w="90"/>
@@ -3991,7 +3991,7 @@
         </w:tc>
         <w:tc>
           <w:tcPr>
-            <w:tcW w:type="dxa" w:w="1560"/>
+            <w:tcW w:type="dxa" w:w="1539"/>
             <w:tcMar>
               <w:top w:type="dxa" w:w="60"/>
               <w:left w:type="dxa" w:w="90"/>
@@ -4017,7 +4017,7 @@
         </w:tc>
         <w:tc>
           <w:tcPr>
-            <w:tcW w:type="dxa" w:w="3770"/>
+            <w:tcW w:type="dxa" w:w="5129"/>
             <w:tcMar>
               <w:top w:type="dxa" w:w="60"/>
               <w:left w:type="dxa" w:w="90"/>
@@ -5042,7 +5042,7 @@
                 <w:sz w:val="17"/>
                 <w:szCs w:val="17"/>
               </w:rPr>
-              <w:t xml:space="preserve"> 발송: 동의 849명 (거래고객·수강생 92 + 9월 신규 동의 665 + 10월 신규 동의 92) — 4절 명단</w:t>
+              <w:t xml:space="preserve"> 발송: 1,427명 (거래고객 147 + 9월 신규 동의 665 + 10월 신규 동의 92 + 이전 가입 동의 523) — 4절 명단</w:t>
             </w:r>
           </w:p>
         </w:tc>
@@ -5589,24 +5589,7 @@
           <w:sz w:val="20"/>
           <w:szCs w:val="20"/>
         </w:rPr>
-        <w:t xml:space="preserve"> 연휴 3일 확보 대여 시간 ≥ 120시간(24시간 기준 약 8%). 미달이면 문자 2차 대상에 마케팅 수신 미응답 거래고객 55명(</w:t>
-      </w:r>
-      <w:r>
-        <w:rPr>
-          <w:rFonts w:ascii="Consolas" w:cs="Consolas" w:eastAsia="Consolas" w:hAnsi="Consolas"/>
-          <w:color w:val="7C2D12"/>
-          <w:sz w:val="18"/>
-          <w:szCs w:val="18"/>
-        </w:rPr>
-        <w:t xml:space="preserve">2_문자1차_미응답_선택</w:t>
-      </w:r>
-      <w:r>
-        <w:rPr>
-          <w:rFonts w:ascii="Malgun Gothic" w:cs="Malgun Gothic" w:eastAsia="Malgun Gothic" w:hAnsi="Malgun Gothic"/>
-          <w:sz w:val="20"/>
-          <w:szCs w:val="20"/>
-        </w:rPr>
-        <w:t xml:space="preserve"> 시트)을 추가하고, 단골 직접 연락 1차 무응답자에게 다시 연락한다.</w:t>
+        <w:t xml:space="preserve"> 연휴 3일 확보 대여 시간 ≥ 120시간(24시간 기준 약 8%). 미달이면 단골 직접 연락 1차 무응답자에게 다시 연락하고, 10/8 오전 스토리를 '남은 시간대' 중심으로 바꾼다.</w:t>
       </w:r>
     </w:p>
     <w:p>
@@ -7161,9 +7144,9 @@
         </w:tblBorders>
       </w:tblPr>
       <w:tblGrid>
-        <w:gridCol w:w="1308"/>
-        <w:gridCol w:w="4026"/>
-        <w:gridCol w:w="4026"/>
+        <w:gridCol w:w="1131"/>
+        <w:gridCol w:w="4114"/>
+        <w:gridCol w:w="4114"/>
       </w:tblGrid>
       <w:tr>
         <w:trPr>
@@ -7171,7 +7154,7 @@
         </w:trPr>
         <w:tc>
           <w:tcPr>
-            <w:tcW w:type="dxa" w:w="1308"/>
+            <w:tcW w:type="dxa" w:w="1131"/>
             <w:shd w:fill="1C1917" w:color="auto" w:val="clear"/>
             <w:tcMar>
               <w:top w:type="dxa" w:w="60"/>
@@ -7199,7 +7182,7 @@
         </w:tc>
         <w:tc>
           <w:tcPr>
-            <w:tcW w:type="dxa" w:w="4026"/>
+            <w:tcW w:type="dxa" w:w="4114"/>
             <w:shd w:fill="1C1917" w:color="auto" w:val="clear"/>
             <w:tcMar>
               <w:top w:type="dxa" w:w="60"/>
@@ -7227,7 +7210,7 @@
         </w:tc>
         <w:tc>
           <w:tcPr>
-            <w:tcW w:type="dxa" w:w="4026"/>
+            <w:tcW w:type="dxa" w:w="4114"/>
             <w:shd w:fill="1C1917" w:color="auto" w:val="clear"/>
             <w:tcMar>
               <w:top w:type="dxa" w:w="60"/>
@@ -7260,31 +7243,31 @@
         </w:trPr>
         <w:tc>
           <w:tcPr>
-            <w:tcW w:type="dxa" w:w="1308"/>
-            <w:tcMar>
-              <w:top w:type="dxa" w:w="60"/>
-              <w:left w:type="dxa" w:w="90"/>
-              <w:bottom w:type="dxa" w:w="60"/>
-              <w:right w:type="dxa" w:w="90"/>
-            </w:tcMar>
-          </w:tcPr>
-          <w:p>
-            <w:pPr>
-              <w:spacing w:after="0"/>
-            </w:pPr>
-            <w:r>
-              <w:rPr>
-                <w:rFonts w:ascii="Malgun Gothic" w:cs="Malgun Gothic" w:eastAsia="Malgun Gothic" w:hAnsi="Malgun Gothic"/>
-                <w:sz w:val="17"/>
-                <w:szCs w:val="17"/>
-              </w:rPr>
-              <w:t xml:space="preserve">1_문자1차_동의</w:t>
-            </w:r>
-          </w:p>
-        </w:tc>
-        <w:tc>
-          <w:tcPr>
-            <w:tcW w:type="dxa" w:w="4026"/>
+            <w:tcW w:type="dxa" w:w="1131"/>
+            <w:tcMar>
+              <w:top w:type="dxa" w:w="60"/>
+              <w:left w:type="dxa" w:w="90"/>
+              <w:bottom w:type="dxa" w:w="60"/>
+              <w:right w:type="dxa" w:w="90"/>
+            </w:tcMar>
+          </w:tcPr>
+          <w:p>
+            <w:pPr>
+              <w:spacing w:after="0"/>
+            </w:pPr>
+            <w:r>
+              <w:rPr>
+                <w:rFonts w:ascii="Malgun Gothic" w:cs="Malgun Gothic" w:eastAsia="Malgun Gothic" w:hAnsi="Malgun Gothic"/>
+                <w:sz w:val="17"/>
+                <w:szCs w:val="17"/>
+              </w:rPr>
+              <w:t xml:space="preserve">1_문자1차</w:t>
+            </w:r>
+          </w:p>
+        </w:tc>
+        <w:tc>
+          <w:tcPr>
+            <w:tcW w:type="dxa" w:w="4114"/>
             <w:tcMar>
               <w:top w:type="dxa" w:w="60"/>
               <w:left w:type="dxa" w:w="90"/>
@@ -7304,21 +7287,21 @@
                 <w:sz w:val="17"/>
                 <w:szCs w:val="17"/>
               </w:rPr>
-              <w:t xml:space="preserve">849명</w:t>
-            </w:r>
-            <w:r>
-              <w:rPr>
-                <w:rFonts w:ascii="Malgun Gothic" w:cs="Malgun Gothic" w:eastAsia="Malgun Gothic" w:hAnsi="Malgun Gothic"/>
-                <w:sz w:val="17"/>
-                <w:szCs w:val="17"/>
-              </w:rPr>
-              <w:t xml:space="preserve"> (거래고객·수강생 92 + 9월 신규 동의 665 + 10/1~10/6 신규 동의 92)</w:t>
-            </w:r>
-          </w:p>
-        </w:tc>
-        <w:tc>
-          <w:tcPr>
-            <w:tcW w:type="dxa" w:w="4026"/>
+              <w:t xml:space="preserve">1,427명</w:t>
+            </w:r>
+            <w:r>
+              <w:rPr>
+                <w:rFonts w:ascii="Malgun Gothic" w:cs="Malgun Gothic" w:eastAsia="Malgun Gothic" w:hAnsi="Malgun Gothic"/>
+                <w:sz w:val="17"/>
+                <w:szCs w:val="17"/>
+              </w:rPr>
+              <w:t xml:space="preserve"> — 거래고객·수강생 동의 92 + 거래고객 수신동의 미응답 55 + 9월 신규 동의 665 + 10/1~10/6 신규 동의 92 + 이전 가입 동의 523</w:t>
+            </w:r>
+          </w:p>
+        </w:tc>
+        <w:tc>
+          <w:tcPr>
+            <w:tcW w:type="dxa" w:w="4114"/>
             <w:tcMar>
               <w:top w:type="dxa" w:w="60"/>
               <w:left w:type="dxa" w:w="90"/>
@@ -7347,73 +7330,73 @@
         </w:trPr>
         <w:tc>
           <w:tcPr>
-            <w:tcW w:type="dxa" w:w="1308"/>
-            <w:tcMar>
-              <w:top w:type="dxa" w:w="60"/>
-              <w:left w:type="dxa" w:w="90"/>
-              <w:bottom w:type="dxa" w:w="60"/>
-              <w:right w:type="dxa" w:w="90"/>
-            </w:tcMar>
-          </w:tcPr>
-          <w:p>
-            <w:pPr>
-              <w:spacing w:after="0"/>
-            </w:pPr>
-            <w:r>
-              <w:rPr>
-                <w:rFonts w:ascii="Malgun Gothic" w:cs="Malgun Gothic" w:eastAsia="Malgun Gothic" w:hAnsi="Malgun Gothic"/>
-                <w:sz w:val="17"/>
-                <w:szCs w:val="17"/>
-              </w:rPr>
-              <w:t xml:space="preserve">2_문자1차_미응답_선택</w:t>
-            </w:r>
-          </w:p>
-        </w:tc>
-        <w:tc>
-          <w:tcPr>
-            <w:tcW w:type="dxa" w:w="4026"/>
-            <w:tcMar>
-              <w:top w:type="dxa" w:w="60"/>
-              <w:left w:type="dxa" w:w="90"/>
-              <w:bottom w:type="dxa" w:w="60"/>
-              <w:right w:type="dxa" w:w="90"/>
-            </w:tcMar>
-          </w:tcPr>
-          <w:p>
-            <w:pPr>
-              <w:spacing w:after="0"/>
-            </w:pPr>
-            <w:r>
-              <w:rPr>
-                <w:rFonts w:ascii="Malgun Gothic" w:cs="Malgun Gothic" w:eastAsia="Malgun Gothic" w:hAnsi="Malgun Gothic"/>
-                <w:sz w:val="17"/>
-                <w:szCs w:val="17"/>
-              </w:rPr>
-              <w:t xml:space="preserve">55명</w:t>
-            </w:r>
-          </w:p>
-        </w:tc>
-        <w:tc>
-          <w:tcPr>
-            <w:tcW w:type="dxa" w:w="4026"/>
-            <w:tcMar>
-              <w:top w:type="dxa" w:w="60"/>
-              <w:left w:type="dxa" w:w="90"/>
-              <w:bottom w:type="dxa" w:w="60"/>
-              <w:right w:type="dxa" w:w="90"/>
-            </w:tcMar>
-          </w:tcPr>
-          <w:p>
-            <w:pPr>
-              <w:spacing w:after="0"/>
-            </w:pPr>
-            <w:r>
-              <w:rPr>
-                <w:rFonts w:ascii="Malgun Gothic" w:cs="Malgun Gothic" w:eastAsia="Malgun Gothic" w:hAnsi="Malgun Gothic"/>
-                <w:sz w:val="17"/>
-                <w:szCs w:val="17"/>
-              </w:rPr>
-              <w:t xml:space="preserve">수신동의 미응답 거래고객. 9/13 운영 결정대로 보낼지, 보수적으로 뺄지 선택</w:t>
+            <w:tcW w:type="dxa" w:w="1131"/>
+            <w:tcMar>
+              <w:top w:type="dxa" w:w="60"/>
+              <w:left w:type="dxa" w:w="90"/>
+              <w:bottom w:type="dxa" w:w="60"/>
+              <w:right w:type="dxa" w:w="90"/>
+            </w:tcMar>
+          </w:tcPr>
+          <w:p>
+            <w:pPr>
+              <w:spacing w:after="0"/>
+            </w:pPr>
+            <w:r>
+              <w:rPr>
+                <w:rFonts w:ascii="Malgun Gothic" w:cs="Malgun Gothic" w:eastAsia="Malgun Gothic" w:hAnsi="Malgun Gothic"/>
+                <w:sz w:val="17"/>
+                <w:szCs w:val="17"/>
+              </w:rPr>
+              <w:t xml:space="preserve">참고_단골직접연락</w:t>
+            </w:r>
+          </w:p>
+        </w:tc>
+        <w:tc>
+          <w:tcPr>
+            <w:tcW w:type="dxa" w:w="4114"/>
+            <w:tcMar>
+              <w:top w:type="dxa" w:w="60"/>
+              <w:left w:type="dxa" w:w="90"/>
+              <w:bottom w:type="dxa" w:w="60"/>
+              <w:right w:type="dxa" w:w="90"/>
+            </w:tcMar>
+          </w:tcPr>
+          <w:p>
+            <w:pPr>
+              <w:spacing w:after="0"/>
+            </w:pPr>
+            <w:r>
+              <w:rPr>
+                <w:rFonts w:ascii="Malgun Gothic" w:cs="Malgun Gothic" w:eastAsia="Malgun Gothic" w:hAnsi="Malgun Gothic"/>
+                <w:sz w:val="17"/>
+                <w:szCs w:val="17"/>
+              </w:rPr>
+              <w:t xml:space="preserve">67명</w:t>
+            </w:r>
+          </w:p>
+        </w:tc>
+        <w:tc>
+          <w:tcPr>
+            <w:tcW w:type="dxa" w:w="4114"/>
+            <w:tcMar>
+              <w:top w:type="dxa" w:w="60"/>
+              <w:left w:type="dxa" w:w="90"/>
+              <w:bottom w:type="dxa" w:w="60"/>
+              <w:right w:type="dxa" w:w="90"/>
+            </w:tcMar>
+          </w:tcPr>
+          <w:p>
+            <w:pPr>
+              <w:spacing w:after="0"/>
+            </w:pPr>
+            <w:r>
+              <w:rPr>
+                <w:rFonts w:ascii="Malgun Gothic" w:cs="Malgun Gothic" w:eastAsia="Malgun Gothic" w:hAnsi="Malgun Gothic"/>
+                <w:sz w:val="17"/>
+                <w:szCs w:val="17"/>
+              </w:rPr>
+              <w:t xml:space="preserve">용산 2회 이상·1박 이상·누적 20만원 이상. 연락일(10/6·10/7·10/8) 배정, 결과·예약여부 칸 기록</w:t>
             </w:r>
           </w:p>
         </w:tc>
@@ -7424,73 +7407,73 @@
         </w:trPr>
         <w:tc>
           <w:tcPr>
-            <w:tcW w:type="dxa" w:w="1308"/>
-            <w:tcMar>
-              <w:top w:type="dxa" w:w="60"/>
-              <w:left w:type="dxa" w:w="90"/>
-              <w:bottom w:type="dxa" w:w="60"/>
-              <w:right w:type="dxa" w:w="90"/>
-            </w:tcMar>
-          </w:tcPr>
-          <w:p>
-            <w:pPr>
-              <w:spacing w:after="0"/>
-            </w:pPr>
-            <w:r>
-              <w:rPr>
-                <w:rFonts w:ascii="Malgun Gothic" w:cs="Malgun Gothic" w:eastAsia="Malgun Gothic" w:hAnsi="Malgun Gothic"/>
-                <w:sz w:val="17"/>
-                <w:szCs w:val="17"/>
-              </w:rPr>
-              <w:t xml:space="preserve">참고_단골직접연락</w:t>
-            </w:r>
-          </w:p>
-        </w:tc>
-        <w:tc>
-          <w:tcPr>
-            <w:tcW w:type="dxa" w:w="4026"/>
-            <w:tcMar>
-              <w:top w:type="dxa" w:w="60"/>
-              <w:left w:type="dxa" w:w="90"/>
-              <w:bottom w:type="dxa" w:w="60"/>
-              <w:right w:type="dxa" w:w="90"/>
-            </w:tcMar>
-          </w:tcPr>
-          <w:p>
-            <w:pPr>
-              <w:spacing w:after="0"/>
-            </w:pPr>
-            <w:r>
-              <w:rPr>
-                <w:rFonts w:ascii="Malgun Gothic" w:cs="Malgun Gothic" w:eastAsia="Malgun Gothic" w:hAnsi="Malgun Gothic"/>
-                <w:sz w:val="17"/>
-                <w:szCs w:val="17"/>
-              </w:rPr>
-              <w:t xml:space="preserve">67명</w:t>
-            </w:r>
-          </w:p>
-        </w:tc>
-        <w:tc>
-          <w:tcPr>
-            <w:tcW w:type="dxa" w:w="4026"/>
-            <w:tcMar>
-              <w:top w:type="dxa" w:w="60"/>
-              <w:left w:type="dxa" w:w="90"/>
-              <w:bottom w:type="dxa" w:w="60"/>
-              <w:right w:type="dxa" w:w="90"/>
-            </w:tcMar>
-          </w:tcPr>
-          <w:p>
-            <w:pPr>
-              <w:spacing w:after="0"/>
-            </w:pPr>
-            <w:r>
-              <w:rPr>
-                <w:rFonts w:ascii="Malgun Gothic" w:cs="Malgun Gothic" w:eastAsia="Malgun Gothic" w:hAnsi="Malgun Gothic"/>
-                <w:sz w:val="17"/>
-                <w:szCs w:val="17"/>
-              </w:rPr>
-              <w:t xml:space="preserve">용산 2회 이상·1박 이상·누적 20만원 이상. 연락일(10/6·10/7·10/8) 배정, 결과·예약여부 칸 기록</w:t>
+            <w:tcW w:type="dxa" w:w="1131"/>
+            <w:tcMar>
+              <w:top w:type="dxa" w:w="60"/>
+              <w:left w:type="dxa" w:w="90"/>
+              <w:bottom w:type="dxa" w:w="60"/>
+              <w:right w:type="dxa" w:w="90"/>
+            </w:tcMar>
+          </w:tcPr>
+          <w:p>
+            <w:pPr>
+              <w:spacing w:after="0"/>
+            </w:pPr>
+            <w:r>
+              <w:rPr>
+                <w:rFonts w:ascii="Malgun Gothic" w:cs="Malgun Gothic" w:eastAsia="Malgun Gothic" w:hAnsi="Malgun Gothic"/>
+                <w:sz w:val="17"/>
+                <w:szCs w:val="17"/>
+              </w:rPr>
+              <w:t xml:space="preserve">참고_연락스크립트</w:t>
+            </w:r>
+          </w:p>
+        </w:tc>
+        <w:tc>
+          <w:tcPr>
+            <w:tcW w:type="dxa" w:w="4114"/>
+            <w:tcMar>
+              <w:top w:type="dxa" w:w="60"/>
+              <w:left w:type="dxa" w:w="90"/>
+              <w:bottom w:type="dxa" w:w="60"/>
+              <w:right w:type="dxa" w:w="90"/>
+            </w:tcMar>
+          </w:tcPr>
+          <w:p>
+            <w:pPr>
+              <w:spacing w:after="0"/>
+            </w:pPr>
+            <w:r>
+              <w:rPr>
+                <w:rFonts w:ascii="Malgun Gothic" w:cs="Malgun Gothic" w:eastAsia="Malgun Gothic" w:hAnsi="Malgun Gothic"/>
+                <w:sz w:val="17"/>
+                <w:szCs w:val="17"/>
+              </w:rPr>
+              <w:t xml:space="preserve">—</w:t>
+            </w:r>
+          </w:p>
+        </w:tc>
+        <w:tc>
+          <w:tcPr>
+            <w:tcW w:type="dxa" w:w="4114"/>
+            <w:tcMar>
+              <w:top w:type="dxa" w:w="60"/>
+              <w:left w:type="dxa" w:w="90"/>
+              <w:bottom w:type="dxa" w:w="60"/>
+              <w:right w:type="dxa" w:w="90"/>
+            </w:tcMar>
+          </w:tcPr>
+          <w:p>
+            <w:pPr>
+              <w:spacing w:after="0"/>
+            </w:pPr>
+            <w:r>
+              <w:rPr>
+                <w:rFonts w:ascii="Malgun Gothic" w:cs="Malgun Gothic" w:eastAsia="Malgun Gothic" w:hAnsi="Malgun Gothic"/>
+                <w:sz w:val="17"/>
+                <w:szCs w:val="17"/>
+              </w:rPr>
+              <w:t xml:space="preserve">직접 연락 말투</w:t>
             </w:r>
           </w:p>
         </w:tc>
@@ -7501,31 +7484,31 @@
         </w:trPr>
         <w:tc>
           <w:tcPr>
-            <w:tcW w:type="dxa" w:w="1308"/>
-            <w:tcMar>
-              <w:top w:type="dxa" w:w="60"/>
-              <w:left w:type="dxa" w:w="90"/>
-              <w:bottom w:type="dxa" w:w="60"/>
-              <w:right w:type="dxa" w:w="90"/>
-            </w:tcMar>
-          </w:tcPr>
-          <w:p>
-            <w:pPr>
-              <w:spacing w:after="0"/>
-            </w:pPr>
-            <w:r>
-              <w:rPr>
-                <w:rFonts w:ascii="Malgun Gothic" w:cs="Malgun Gothic" w:eastAsia="Malgun Gothic" w:hAnsi="Malgun Gothic"/>
-                <w:sz w:val="17"/>
-                <w:szCs w:val="17"/>
-              </w:rPr>
-              <w:t xml:space="preserve">참고_연락스크립트</w:t>
-            </w:r>
-          </w:p>
-        </w:tc>
-        <w:tc>
-          <w:tcPr>
-            <w:tcW w:type="dxa" w:w="4026"/>
+            <w:tcW w:type="dxa" w:w="1131"/>
+            <w:tcMar>
+              <w:top w:type="dxa" w:w="60"/>
+              <w:left w:type="dxa" w:w="90"/>
+              <w:bottom w:type="dxa" w:w="60"/>
+              <w:right w:type="dxa" w:w="90"/>
+            </w:tcMar>
+          </w:tcPr>
+          <w:p>
+            <w:pPr>
+              <w:spacing w:after="0"/>
+            </w:pPr>
+            <w:r>
+              <w:rPr>
+                <w:rFonts w:ascii="Malgun Gothic" w:cs="Malgun Gothic" w:eastAsia="Malgun Gothic" w:hAnsi="Malgun Gothic"/>
+                <w:sz w:val="17"/>
+                <w:szCs w:val="17"/>
+              </w:rPr>
+              <w:t xml:space="preserve">문안</w:t>
+            </w:r>
+          </w:p>
+        </w:tc>
+        <w:tc>
+          <w:tcPr>
+            <w:tcW w:type="dxa" w:w="4114"/>
             <w:tcMar>
               <w:top w:type="dxa" w:w="60"/>
               <w:left w:type="dxa" w:w="90"/>
@@ -7549,25 +7532,25 @@
         </w:tc>
         <w:tc>
           <w:tcPr>
-            <w:tcW w:type="dxa" w:w="4026"/>
-            <w:tcMar>
-              <w:top w:type="dxa" w:w="60"/>
-              <w:left w:type="dxa" w:w="90"/>
-              <w:bottom w:type="dxa" w:w="60"/>
-              <w:right w:type="dxa" w:w="90"/>
-            </w:tcMar>
-          </w:tcPr>
-          <w:p>
-            <w:pPr>
-              <w:spacing w:after="0"/>
-            </w:pPr>
-            <w:r>
-              <w:rPr>
-                <w:rFonts w:ascii="Malgun Gothic" w:cs="Malgun Gothic" w:eastAsia="Malgun Gothic" w:hAnsi="Malgun Gothic"/>
-                <w:sz w:val="17"/>
-                <w:szCs w:val="17"/>
-              </w:rPr>
-              <w:t xml:space="preserve">직접 연락 말투</w:t>
+            <w:tcW w:type="dxa" w:w="4114"/>
+            <w:tcMar>
+              <w:top w:type="dxa" w:w="60"/>
+              <w:left w:type="dxa" w:w="90"/>
+              <w:bottom w:type="dxa" w:w="60"/>
+              <w:right w:type="dxa" w:w="90"/>
+            </w:tcMar>
+          </w:tcPr>
+          <w:p>
+            <w:pPr>
+              <w:spacing w:after="0"/>
+            </w:pPr>
+            <w:r>
+              <w:rPr>
+                <w:rFonts w:ascii="Malgun Gothic" w:cs="Malgun Gothic" w:eastAsia="Malgun Gothic" w:hAnsi="Malgun Gothic"/>
+                <w:sz w:val="17"/>
+                <w:szCs w:val="17"/>
+              </w:rPr>
+              <w:t xml:space="preserve">1차 392바이트 · 2차 244바이트 (LMS)</w:t>
             </w:r>
           </w:p>
         </w:tc>
@@ -7578,73 +7561,73 @@
         </w:trPr>
         <w:tc>
           <w:tcPr>
-            <w:tcW w:type="dxa" w:w="1308"/>
-            <w:tcMar>
-              <w:top w:type="dxa" w:w="60"/>
-              <w:left w:type="dxa" w:w="90"/>
-              <w:bottom w:type="dxa" w:w="60"/>
-              <w:right w:type="dxa" w:w="90"/>
-            </w:tcMar>
-          </w:tcPr>
-          <w:p>
-            <w:pPr>
-              <w:spacing w:after="0"/>
-            </w:pPr>
-            <w:r>
-              <w:rPr>
-                <w:rFonts w:ascii="Malgun Gothic" w:cs="Malgun Gothic" w:eastAsia="Malgun Gothic" w:hAnsi="Malgun Gothic"/>
-                <w:sz w:val="17"/>
-                <w:szCs w:val="17"/>
-              </w:rPr>
-              <w:t xml:space="preserve">문안</w:t>
-            </w:r>
-          </w:p>
-        </w:tc>
-        <w:tc>
-          <w:tcPr>
-            <w:tcW w:type="dxa" w:w="4026"/>
-            <w:tcMar>
-              <w:top w:type="dxa" w:w="60"/>
-              <w:left w:type="dxa" w:w="90"/>
-              <w:bottom w:type="dxa" w:w="60"/>
-              <w:right w:type="dxa" w:w="90"/>
-            </w:tcMar>
-          </w:tcPr>
-          <w:p>
-            <w:pPr>
-              <w:spacing w:after="0"/>
-            </w:pPr>
-            <w:r>
-              <w:rPr>
-                <w:rFonts w:ascii="Malgun Gothic" w:cs="Malgun Gothic" w:eastAsia="Malgun Gothic" w:hAnsi="Malgun Gothic"/>
-                <w:sz w:val="17"/>
-                <w:szCs w:val="17"/>
-              </w:rPr>
-              <w:t xml:space="preserve">—</w:t>
-            </w:r>
-          </w:p>
-        </w:tc>
-        <w:tc>
-          <w:tcPr>
-            <w:tcW w:type="dxa" w:w="4026"/>
-            <w:tcMar>
-              <w:top w:type="dxa" w:w="60"/>
-              <w:left w:type="dxa" w:w="90"/>
-              <w:bottom w:type="dxa" w:w="60"/>
-              <w:right w:type="dxa" w:w="90"/>
-            </w:tcMar>
-          </w:tcPr>
-          <w:p>
-            <w:pPr>
-              <w:spacing w:after="0"/>
-            </w:pPr>
-            <w:r>
-              <w:rPr>
-                <w:rFonts w:ascii="Malgun Gothic" w:cs="Malgun Gothic" w:eastAsia="Malgun Gothic" w:hAnsi="Malgun Gothic"/>
-                <w:sz w:val="17"/>
-                <w:szCs w:val="17"/>
-              </w:rPr>
-              <w:t xml:space="preserve">1차 392바이트 · 2차 244바이트 (LMS)</w:t>
+            <w:tcW w:type="dxa" w:w="1131"/>
+            <w:tcMar>
+              <w:top w:type="dxa" w:w="60"/>
+              <w:left w:type="dxa" w:w="90"/>
+              <w:bottom w:type="dxa" w:w="60"/>
+              <w:right w:type="dxa" w:w="90"/>
+            </w:tcMar>
+          </w:tcPr>
+          <w:p>
+            <w:pPr>
+              <w:spacing w:after="0"/>
+            </w:pPr>
+            <w:r>
+              <w:rPr>
+                <w:rFonts w:ascii="Malgun Gothic" w:cs="Malgun Gothic" w:eastAsia="Malgun Gothic" w:hAnsi="Malgun Gothic"/>
+                <w:sz w:val="17"/>
+                <w:szCs w:val="17"/>
+              </w:rPr>
+              <w:t xml:space="preserve">3_선택_이전동의회원</w:t>
+            </w:r>
+          </w:p>
+        </w:tc>
+        <w:tc>
+          <w:tcPr>
+            <w:tcW w:type="dxa" w:w="4114"/>
+            <w:tcMar>
+              <w:top w:type="dxa" w:w="60"/>
+              <w:left w:type="dxa" w:w="90"/>
+              <w:bottom w:type="dxa" w:w="60"/>
+              <w:right w:type="dxa" w:w="90"/>
+            </w:tcMar>
+          </w:tcPr>
+          <w:p>
+            <w:pPr>
+              <w:spacing w:after="0"/>
+            </w:pPr>
+            <w:r>
+              <w:rPr>
+                <w:rFonts w:ascii="Malgun Gothic" w:cs="Malgun Gothic" w:eastAsia="Malgun Gothic" w:hAnsi="Malgun Gothic"/>
+                <w:sz w:val="17"/>
+                <w:szCs w:val="17"/>
+              </w:rPr>
+              <w:t xml:space="preserve">548명</w:t>
+            </w:r>
+          </w:p>
+        </w:tc>
+        <w:tc>
+          <w:tcPr>
+            <w:tcW w:type="dxa" w:w="4114"/>
+            <w:tcMar>
+              <w:top w:type="dxa" w:w="60"/>
+              <w:left w:type="dxa" w:w="90"/>
+              <w:bottom w:type="dxa" w:w="60"/>
+              <w:right w:type="dxa" w:w="90"/>
+            </w:tcMar>
+          </w:tcPr>
+          <w:p>
+            <w:pPr>
+              <w:spacing w:after="0"/>
+            </w:pPr>
+            <w:r>
+              <w:rPr>
+                <w:rFonts w:ascii="Malgun Gothic" w:cs="Malgun Gothic" w:eastAsia="Malgun Gothic" w:hAnsi="Malgun Gothic"/>
+                <w:sz w:val="17"/>
+                <w:szCs w:val="17"/>
+              </w:rPr>
+              <w:t xml:space="preserve">8월 이전 가입한 동의 회원(9/4 회차 등에서 받은 사람). 넓게 보내려면 포함. 휴면 전환율은 낮다(2.5%)</w:t>
             </w:r>
           </w:p>
         </w:tc>
@@ -7655,84 +7638,7 @@
         </w:trPr>
         <w:tc>
           <w:tcPr>
-            <w:tcW w:type="dxa" w:w="1308"/>
-            <w:tcMar>
-              <w:top w:type="dxa" w:w="60"/>
-              <w:left w:type="dxa" w:w="90"/>
-              <w:bottom w:type="dxa" w:w="60"/>
-              <w:right w:type="dxa" w:w="90"/>
-            </w:tcMar>
-          </w:tcPr>
-          <w:p>
-            <w:pPr>
-              <w:spacing w:after="0"/>
-            </w:pPr>
-            <w:r>
-              <w:rPr>
-                <w:rFonts w:ascii="Malgun Gothic" w:cs="Malgun Gothic" w:eastAsia="Malgun Gothic" w:hAnsi="Malgun Gothic"/>
-                <w:sz w:val="17"/>
-                <w:szCs w:val="17"/>
-              </w:rPr>
-              <w:t xml:space="preserve">3_선택_이전동의회원</w:t>
-            </w:r>
-          </w:p>
-        </w:tc>
-        <w:tc>
-          <w:tcPr>
-            <w:tcW w:type="dxa" w:w="4026"/>
-            <w:tcMar>
-              <w:top w:type="dxa" w:w="60"/>
-              <w:left w:type="dxa" w:w="90"/>
-              <w:bottom w:type="dxa" w:w="60"/>
-              <w:right w:type="dxa" w:w="90"/>
-            </w:tcMar>
-          </w:tcPr>
-          <w:p>
-            <w:pPr>
-              <w:spacing w:after="0"/>
-            </w:pPr>
-            <w:r>
-              <w:rPr>
-                <w:rFonts w:ascii="Malgun Gothic" w:cs="Malgun Gothic" w:eastAsia="Malgun Gothic" w:hAnsi="Malgun Gothic"/>
-                <w:sz w:val="17"/>
-                <w:szCs w:val="17"/>
-              </w:rPr>
-              <w:t xml:space="preserve">548명</w:t>
-            </w:r>
-          </w:p>
-        </w:tc>
-        <w:tc>
-          <w:tcPr>
-            <w:tcW w:type="dxa" w:w="4026"/>
-            <w:tcMar>
-              <w:top w:type="dxa" w:w="60"/>
-              <w:left w:type="dxa" w:w="90"/>
-              <w:bottom w:type="dxa" w:w="60"/>
-              <w:right w:type="dxa" w:w="90"/>
-            </w:tcMar>
-          </w:tcPr>
-          <w:p>
-            <w:pPr>
-              <w:spacing w:after="0"/>
-            </w:pPr>
-            <w:r>
-              <w:rPr>
-                <w:rFonts w:ascii="Malgun Gothic" w:cs="Malgun Gothic" w:eastAsia="Malgun Gothic" w:hAnsi="Malgun Gothic"/>
-                <w:sz w:val="17"/>
-                <w:szCs w:val="17"/>
-              </w:rPr>
-              <w:t xml:space="preserve">8월 이전 가입한 동의 회원(9/4 회차 등에서 받은 사람). 넓게 보내려면 포함. 휴면 전환율은 낮다(2.5%)</w:t>
-            </w:r>
-          </w:p>
-        </w:tc>
-      </w:tr>
-      <w:tr>
-        <w:trPr>
-          <w:tblHeader w:val="false"/>
-        </w:trPr>
-        <w:tc>
-          <w:tcPr>
-            <w:tcW w:type="dxa" w:w="1308"/>
+            <w:tcW w:type="dxa" w:w="1131"/>
             <w:tcMar>
               <w:top w:type="dxa" w:w="60"/>
               <w:left w:type="dxa" w:w="90"/>
@@ -7756,49 +7662,49 @@
         </w:tc>
         <w:tc>
           <w:tcPr>
-            <w:tcW w:type="dxa" w:w="4026"/>
-            <w:tcMar>
-              <w:top w:type="dxa" w:w="60"/>
-              <w:left w:type="dxa" w:w="90"/>
-              <w:bottom w:type="dxa" w:w="60"/>
-              <w:right w:type="dxa" w:w="90"/>
-            </w:tcMar>
-          </w:tcPr>
-          <w:p>
-            <w:pPr>
-              <w:spacing w:after="0"/>
-            </w:pPr>
-            <w:r>
-              <w:rPr>
-                <w:rFonts w:ascii="Malgun Gothic" w:cs="Malgun Gothic" w:eastAsia="Malgun Gothic" w:hAnsi="Malgun Gothic"/>
-                <w:sz w:val="17"/>
-                <w:szCs w:val="17"/>
-              </w:rPr>
-              <w:t xml:space="preserve">14명</w:t>
-            </w:r>
-          </w:p>
-        </w:tc>
-        <w:tc>
-          <w:tcPr>
-            <w:tcW w:type="dxa" w:w="4026"/>
-            <w:tcMar>
-              <w:top w:type="dxa" w:w="60"/>
-              <w:left w:type="dxa" w:w="90"/>
-              <w:bottom w:type="dxa" w:w="60"/>
-              <w:right w:type="dxa" w:w="90"/>
-            </w:tcMar>
-          </w:tcPr>
-          <w:p>
-            <w:pPr>
-              <w:spacing w:after="0"/>
-            </w:pPr>
-            <w:r>
-              <w:rPr>
-                <w:rFonts w:ascii="Malgun Gothic" w:cs="Malgun Gothic" w:eastAsia="Malgun Gothic" w:hAnsi="Malgun Gothic"/>
-                <w:sz w:val="17"/>
-                <w:szCs w:val="17"/>
-              </w:rPr>
-              <w:t xml:space="preserve">다른 지점(분당·진주·대구·제주)만 이용 10 · 비회원 2 · 10/7~10/11 예약 보유 2 (광고 미동의 80명은 10/1 명단에서 이미 빠짐)</w:t>
+            <w:tcW w:type="dxa" w:w="4114"/>
+            <w:tcMar>
+              <w:top w:type="dxa" w:w="60"/>
+              <w:left w:type="dxa" w:w="90"/>
+              <w:bottom w:type="dxa" w:w="60"/>
+              <w:right w:type="dxa" w:w="90"/>
+            </w:tcMar>
+          </w:tcPr>
+          <w:p>
+            <w:pPr>
+              <w:spacing w:after="0"/>
+            </w:pPr>
+            <w:r>
+              <w:rPr>
+                <w:rFonts w:ascii="Malgun Gothic" w:cs="Malgun Gothic" w:eastAsia="Malgun Gothic" w:hAnsi="Malgun Gothic"/>
+                <w:sz w:val="17"/>
+                <w:szCs w:val="17"/>
+              </w:rPr>
+              <w:t xml:space="preserve">39명</w:t>
+            </w:r>
+          </w:p>
+        </w:tc>
+        <w:tc>
+          <w:tcPr>
+            <w:tcW w:type="dxa" w:w="4114"/>
+            <w:tcMar>
+              <w:top w:type="dxa" w:w="60"/>
+              <w:left w:type="dxa" w:w="90"/>
+              <w:bottom w:type="dxa" w:w="60"/>
+              <w:right w:type="dxa" w:w="90"/>
+            </w:tcMar>
+          </w:tcPr>
+          <w:p>
+            <w:pPr>
+              <w:spacing w:after="0"/>
+            </w:pPr>
+            <w:r>
+              <w:rPr>
+                <w:rFonts w:ascii="Malgun Gothic" w:cs="Malgun Gothic" w:eastAsia="Malgun Gothic" w:hAnsi="Malgun Gothic"/>
+                <w:sz w:val="17"/>
+                <w:szCs w:val="17"/>
+              </w:rPr>
+              <w:t xml:space="preserve">다른 지점(분당·진주·대구·제주)만 이용 25 · 광고 미동의 9 · 10/7~10/11 예약 보유 3 · 비회원 2</w:t>
             </w:r>
           </w:p>
         </w:tc>
@@ -7896,7 +7802,7 @@
           <w:sz w:val="20"/>
           <w:szCs w:val="20"/>
         </w:rPr>
-        <w:t xml:space="preserve">(9,190명)로 10/1~10/6 가입 동의자를 더하고, 모든 대상의 수신동의 상태를 현재 값으로 갱신했다(미응답 → 동의 1명 이동). 발송 직전 최신 회원 설문을 넣고 다시 돌리면 새 가입자·수신거부가 반영된다.</w:t>
+        <w:t xml:space="preserve">(9,190명)로 10/1~10/6 가입 동의자를 더하고, 모든 대상의 수신동의 상태를 현재 값으로 갱신했다(미응답 → 동의 1명). 10/6 결정으로 이전 가입 동의 회원과 수신동의 미응답 거래고객도 모두 포함했다. 발송 직전 최신 회원 설문을 넣고 다시 돌리면 새 가입자·수신거부가 반영된다.</w:t>
       </w:r>
     </w:p>
     <w:p>

</xml_diff>

<commit_message>
Exclude unasked (pre-survey) members from ad SMS and direct contact; update plan and manager notice
Co-Authored-By: Claude Opus 5.5 <noreply@anthropic.com>
Claude-Session: https://claude.ai/code/session_01MNAKb9sccB4tN87nMGAtUU
</commit_message>
<xml_diff>
--- a/crm/output/용산_한글날_시승오퍼_실행계획_1006-1009.docx
+++ b/crm/output/용산_한글날_시승오퍼_실행계획_1006-1009.docx
@@ -3395,9 +3395,9 @@
         </w:tblBorders>
       </w:tblPr>
       <w:tblGrid>
-        <w:gridCol w:w="2693"/>
-        <w:gridCol w:w="1539"/>
-        <w:gridCol w:w="5129"/>
+        <w:gridCol w:w="4095"/>
+        <w:gridCol w:w="1404"/>
+        <w:gridCol w:w="3861"/>
       </w:tblGrid>
       <w:tr>
         <w:trPr>
@@ -3405,7 +3405,7 @@
         </w:trPr>
         <w:tc>
           <w:tcPr>
-            <w:tcW w:type="dxa" w:w="2693"/>
+            <w:tcW w:type="dxa" w:w="4095"/>
             <w:shd w:fill="1C1917" w:color="auto" w:val="clear"/>
             <w:tcMar>
               <w:top w:type="dxa" w:w="60"/>
@@ -3433,7 +3433,7 @@
         </w:tc>
         <w:tc>
           <w:tcPr>
-            <w:tcW w:type="dxa" w:w="1539"/>
+            <w:tcW w:type="dxa" w:w="1404"/>
             <w:shd w:fill="1C1917" w:color="auto" w:val="clear"/>
             <w:tcMar>
               <w:top w:type="dxa" w:w="60"/>
@@ -3461,7 +3461,7 @@
         </w:tc>
         <w:tc>
           <w:tcPr>
-            <w:tcW w:type="dxa" w:w="5129"/>
+            <w:tcW w:type="dxa" w:w="3861"/>
             <w:shd w:fill="1C1917" w:color="auto" w:val="clear"/>
             <w:tcMar>
               <w:top w:type="dxa" w:w="60"/>
@@ -3494,73 +3494,73 @@
         </w:trPr>
         <w:tc>
           <w:tcPr>
-            <w:tcW w:type="dxa" w:w="2693"/>
-            <w:tcMar>
-              <w:top w:type="dxa" w:w="60"/>
-              <w:left w:type="dxa" w:w="90"/>
-              <w:bottom w:type="dxa" w:w="60"/>
-              <w:right w:type="dxa" w:w="90"/>
-            </w:tcMar>
-          </w:tcPr>
-          <w:p>
-            <w:pPr>
-              <w:spacing w:after="0"/>
-            </w:pPr>
-            <w:r>
-              <w:rPr>
-                <w:rFonts w:ascii="Malgun Gothic" w:cs="Malgun Gothic" w:eastAsia="Malgun Gothic" w:hAnsi="Malgun Gothic"/>
-                <w:sz w:val="17"/>
-                <w:szCs w:val="17"/>
-              </w:rPr>
-              <w:t xml:space="preserve">회원 문자 2회 (1,427명)</w:t>
-            </w:r>
-          </w:p>
-        </w:tc>
-        <w:tc>
-          <w:tcPr>
-            <w:tcW w:type="dxa" w:w="1539"/>
-            <w:tcMar>
-              <w:top w:type="dxa" w:w="60"/>
-              <w:left w:type="dxa" w:w="90"/>
-              <w:bottom w:type="dxa" w:w="60"/>
-              <w:right w:type="dxa" w:w="90"/>
-            </w:tcMar>
-          </w:tcPr>
-          <w:p>
-            <w:pPr>
-              <w:spacing w:after="0"/>
-            </w:pPr>
-            <w:r>
-              <w:rPr>
-                <w:rFonts w:ascii="Malgun Gothic" w:cs="Malgun Gothic" w:eastAsia="Malgun Gothic" w:hAnsi="Malgun Gothic"/>
-                <w:sz w:val="17"/>
-                <w:szCs w:val="17"/>
-              </w:rPr>
-              <w:t xml:space="preserve">약 12건</w:t>
-            </w:r>
-          </w:p>
-        </w:tc>
-        <w:tc>
-          <w:tcPr>
-            <w:tcW w:type="dxa" w:w="5129"/>
-            <w:tcMar>
-              <w:top w:type="dxa" w:w="60"/>
-              <w:left w:type="dxa" w:w="90"/>
-              <w:bottom w:type="dxa" w:w="60"/>
-              <w:right w:type="dxa" w:w="90"/>
-            </w:tcMar>
-          </w:tcPr>
-          <w:p>
-            <w:pPr>
-              <w:spacing w:after="0"/>
-            </w:pPr>
-            <w:r>
-              <w:rPr>
-                <w:rFonts w:ascii="Malgun Gothic" w:cs="Malgun Gothic" w:eastAsia="Malgun Gothic" w:hAnsi="Malgun Gothic"/>
-                <w:sz w:val="17"/>
-                <w:szCs w:val="17"/>
-              </w:rPr>
-              <w:t xml:space="preserve">약 80만 (이전 가입 동의 523명 추가분 +10~25만은 예상치에 넣지 않음)</w:t>
+            <w:tcW w:type="dxa" w:w="4095"/>
+            <w:tcMar>
+              <w:top w:type="dxa" w:w="60"/>
+              <w:left w:type="dxa" w:w="90"/>
+              <w:bottom w:type="dxa" w:w="60"/>
+              <w:right w:type="dxa" w:w="90"/>
+            </w:tcMar>
+          </w:tcPr>
+          <w:p>
+            <w:pPr>
+              <w:spacing w:after="0"/>
+            </w:pPr>
+            <w:r>
+              <w:rPr>
+                <w:rFonts w:ascii="Malgun Gothic" w:cs="Malgun Gothic" w:eastAsia="Malgun Gothic" w:hAnsi="Malgun Gothic"/>
+                <w:sz w:val="17"/>
+                <w:szCs w:val="17"/>
+              </w:rPr>
+              <w:t xml:space="preserve">회원 문자 2회 (1,372명, 이전 가입 동의 523명 포함)</w:t>
+            </w:r>
+          </w:p>
+        </w:tc>
+        <w:tc>
+          <w:tcPr>
+            <w:tcW w:type="dxa" w:w="1404"/>
+            <w:tcMar>
+              <w:top w:type="dxa" w:w="60"/>
+              <w:left w:type="dxa" w:w="90"/>
+              <w:bottom w:type="dxa" w:w="60"/>
+              <w:right w:type="dxa" w:w="90"/>
+            </w:tcMar>
+          </w:tcPr>
+          <w:p>
+            <w:pPr>
+              <w:spacing w:after="0"/>
+            </w:pPr>
+            <w:r>
+              <w:rPr>
+                <w:rFonts w:ascii="Malgun Gothic" w:cs="Malgun Gothic" w:eastAsia="Malgun Gothic" w:hAnsi="Malgun Gothic"/>
+                <w:sz w:val="17"/>
+                <w:szCs w:val="17"/>
+              </w:rPr>
+              <w:t xml:space="preserve">약 15건</w:t>
+            </w:r>
+          </w:p>
+        </w:tc>
+        <w:tc>
+          <w:tcPr>
+            <w:tcW w:type="dxa" w:w="3861"/>
+            <w:tcMar>
+              <w:top w:type="dxa" w:w="60"/>
+              <w:left w:type="dxa" w:w="90"/>
+              <w:bottom w:type="dxa" w:w="60"/>
+              <w:right w:type="dxa" w:w="90"/>
+            </w:tcMar>
+          </w:tcPr>
+          <w:p>
+            <w:pPr>
+              <w:spacing w:after="0"/>
+            </w:pPr>
+            <w:r>
+              <w:rPr>
+                <w:rFonts w:ascii="Malgun Gothic" w:cs="Malgun Gothic" w:eastAsia="Malgun Gothic" w:hAnsi="Malgun Gothic"/>
+                <w:sz w:val="17"/>
+                <w:szCs w:val="17"/>
+              </w:rPr>
+              <w:t xml:space="preserve">약 100만</w:t>
             </w:r>
           </w:p>
         </w:tc>
@@ -3571,73 +3571,73 @@
         </w:trPr>
         <w:tc>
           <w:tcPr>
-            <w:tcW w:type="dxa" w:w="2693"/>
-            <w:tcMar>
-              <w:top w:type="dxa" w:w="60"/>
-              <w:left w:type="dxa" w:w="90"/>
-              <w:bottom w:type="dxa" w:w="60"/>
-              <w:right w:type="dxa" w:w="90"/>
-            </w:tcMar>
-          </w:tcPr>
-          <w:p>
-            <w:pPr>
-              <w:spacing w:after="0"/>
-            </w:pPr>
-            <w:r>
-              <w:rPr>
-                <w:rFonts w:ascii="Malgun Gothic" w:cs="Malgun Gothic" w:eastAsia="Malgun Gothic" w:hAnsi="Malgun Gothic"/>
-                <w:sz w:val="17"/>
-                <w:szCs w:val="17"/>
-              </w:rPr>
-              <w:t xml:space="preserve">단골 직접 연락 (68명)</w:t>
-            </w:r>
-          </w:p>
-        </w:tc>
-        <w:tc>
-          <w:tcPr>
-            <w:tcW w:type="dxa" w:w="1539"/>
-            <w:tcMar>
-              <w:top w:type="dxa" w:w="60"/>
-              <w:left w:type="dxa" w:w="90"/>
-              <w:bottom w:type="dxa" w:w="60"/>
-              <w:right w:type="dxa" w:w="90"/>
-            </w:tcMar>
-          </w:tcPr>
-          <w:p>
-            <w:pPr>
-              <w:spacing w:after="0"/>
-            </w:pPr>
-            <w:r>
-              <w:rPr>
-                <w:rFonts w:ascii="Malgun Gothic" w:cs="Malgun Gothic" w:eastAsia="Malgun Gothic" w:hAnsi="Malgun Gothic"/>
-                <w:sz w:val="17"/>
-                <w:szCs w:val="17"/>
-              </w:rPr>
-              <w:t xml:space="preserve">약 8건</w:t>
-            </w:r>
-          </w:p>
-        </w:tc>
-        <w:tc>
-          <w:tcPr>
-            <w:tcW w:type="dxa" w:w="5129"/>
-            <w:tcMar>
-              <w:top w:type="dxa" w:w="60"/>
-              <w:left w:type="dxa" w:w="90"/>
-              <w:bottom w:type="dxa" w:w="60"/>
-              <w:right w:type="dxa" w:w="90"/>
-            </w:tcMar>
-          </w:tcPr>
-          <w:p>
-            <w:pPr>
-              <w:spacing w:after="0"/>
-            </w:pPr>
-            <w:r>
-              <w:rPr>
-                <w:rFonts w:ascii="Malgun Gothic" w:cs="Malgun Gothic" w:eastAsia="Malgun Gothic" w:hAnsi="Malgun Gothic"/>
-                <w:sz w:val="17"/>
-                <w:szCs w:val="17"/>
-              </w:rPr>
-              <w:t xml:space="preserve">약 70만</w:t>
+            <w:tcW w:type="dxa" w:w="4095"/>
+            <w:tcMar>
+              <w:top w:type="dxa" w:w="60"/>
+              <w:left w:type="dxa" w:w="90"/>
+              <w:bottom w:type="dxa" w:w="60"/>
+              <w:right w:type="dxa" w:w="90"/>
+            </w:tcMar>
+          </w:tcPr>
+          <w:p>
+            <w:pPr>
+              <w:spacing w:after="0"/>
+            </w:pPr>
+            <w:r>
+              <w:rPr>
+                <w:rFonts w:ascii="Malgun Gothic" w:cs="Malgun Gothic" w:eastAsia="Malgun Gothic" w:hAnsi="Malgun Gothic"/>
+                <w:sz w:val="17"/>
+                <w:szCs w:val="17"/>
+              </w:rPr>
+              <w:t xml:space="preserve">단골 직접 연락 (수신동의한 40명)</w:t>
+            </w:r>
+          </w:p>
+        </w:tc>
+        <w:tc>
+          <w:tcPr>
+            <w:tcW w:type="dxa" w:w="1404"/>
+            <w:tcMar>
+              <w:top w:type="dxa" w:w="60"/>
+              <w:left w:type="dxa" w:w="90"/>
+              <w:bottom w:type="dxa" w:w="60"/>
+              <w:right w:type="dxa" w:w="90"/>
+            </w:tcMar>
+          </w:tcPr>
+          <w:p>
+            <w:pPr>
+              <w:spacing w:after="0"/>
+            </w:pPr>
+            <w:r>
+              <w:rPr>
+                <w:rFonts w:ascii="Malgun Gothic" w:cs="Malgun Gothic" w:eastAsia="Malgun Gothic" w:hAnsi="Malgun Gothic"/>
+                <w:sz w:val="17"/>
+                <w:szCs w:val="17"/>
+              </w:rPr>
+              <w:t xml:space="preserve">약 5건</w:t>
+            </w:r>
+          </w:p>
+        </w:tc>
+        <w:tc>
+          <w:tcPr>
+            <w:tcW w:type="dxa" w:w="3861"/>
+            <w:tcMar>
+              <w:top w:type="dxa" w:w="60"/>
+              <w:left w:type="dxa" w:w="90"/>
+              <w:bottom w:type="dxa" w:w="60"/>
+              <w:right w:type="dxa" w:w="90"/>
+            </w:tcMar>
+          </w:tcPr>
+          <w:p>
+            <w:pPr>
+              <w:spacing w:after="0"/>
+            </w:pPr>
+            <w:r>
+              <w:rPr>
+                <w:rFonts w:ascii="Malgun Gothic" w:cs="Malgun Gothic" w:eastAsia="Malgun Gothic" w:hAnsi="Malgun Gothic"/>
+                <w:sz w:val="17"/>
+                <w:szCs w:val="17"/>
+              </w:rPr>
+              <w:t xml:space="preserve">약 45만</w:t>
             </w:r>
           </w:p>
         </w:tc>
@@ -3648,7 +3648,7 @@
         </w:trPr>
         <w:tc>
           <w:tcPr>
-            <w:tcW w:type="dxa" w:w="2693"/>
+            <w:tcW w:type="dxa" w:w="4095"/>
             <w:tcMar>
               <w:top w:type="dxa" w:w="60"/>
               <w:left w:type="dxa" w:w="90"/>
@@ -3672,7 +3672,7 @@
         </w:tc>
         <w:tc>
           <w:tcPr>
-            <w:tcW w:type="dxa" w:w="1539"/>
+            <w:tcW w:type="dxa" w:w="1404"/>
             <w:tcMar>
               <w:top w:type="dxa" w:w="60"/>
               <w:left w:type="dxa" w:w="90"/>
@@ -3696,7 +3696,7 @@
         </w:tc>
         <w:tc>
           <w:tcPr>
-            <w:tcW w:type="dxa" w:w="5129"/>
+            <w:tcW w:type="dxa" w:w="3861"/>
             <w:tcMar>
               <w:top w:type="dxa" w:w="60"/>
               <w:left w:type="dxa" w:w="90"/>
@@ -3725,7 +3725,7 @@
         </w:trPr>
         <w:tc>
           <w:tcPr>
-            <w:tcW w:type="dxa" w:w="2693"/>
+            <w:tcW w:type="dxa" w:w="4095"/>
             <w:tcMar>
               <w:top w:type="dxa" w:w="60"/>
               <w:left w:type="dxa" w:w="90"/>
@@ -3749,7 +3749,7 @@
         </w:tc>
         <w:tc>
           <w:tcPr>
-            <w:tcW w:type="dxa" w:w="1539"/>
+            <w:tcW w:type="dxa" w:w="1404"/>
             <w:tcMar>
               <w:top w:type="dxa" w:w="60"/>
               <w:left w:type="dxa" w:w="90"/>
@@ -3773,7 +3773,7 @@
         </w:tc>
         <w:tc>
           <w:tcPr>
-            <w:tcW w:type="dxa" w:w="5129"/>
+            <w:tcW w:type="dxa" w:w="3861"/>
             <w:tcMar>
               <w:top w:type="dxa" w:w="60"/>
               <w:left w:type="dxa" w:w="90"/>
@@ -3802,7 +3802,7 @@
         </w:trPr>
         <w:tc>
           <w:tcPr>
-            <w:tcW w:type="dxa" w:w="2693"/>
+            <w:tcW w:type="dxa" w:w="4095"/>
             <w:tcMar>
               <w:top w:type="dxa" w:w="60"/>
               <w:left w:type="dxa" w:w="90"/>
@@ -3835,7 +3835,7 @@
         </w:tc>
         <w:tc>
           <w:tcPr>
-            <w:tcW w:type="dxa" w:w="1539"/>
+            <w:tcW w:type="dxa" w:w="1404"/>
             <w:tcMar>
               <w:top w:type="dxa" w:w="60"/>
               <w:left w:type="dxa" w:w="90"/>
@@ -3859,7 +3859,7 @@
         </w:tc>
         <w:tc>
           <w:tcPr>
-            <w:tcW w:type="dxa" w:w="5129"/>
+            <w:tcW w:type="dxa" w:w="3861"/>
             <w:tcMar>
               <w:top w:type="dxa" w:w="60"/>
               <w:left w:type="dxa" w:w="90"/>
@@ -3888,7 +3888,7 @@
         </w:trPr>
         <w:tc>
           <w:tcPr>
-            <w:tcW w:type="dxa" w:w="2693"/>
+            <w:tcW w:type="dxa" w:w="4095"/>
             <w:tcMar>
               <w:top w:type="dxa" w:w="60"/>
               <w:left w:type="dxa" w:w="90"/>
@@ -3912,7 +3912,7 @@
         </w:tc>
         <w:tc>
           <w:tcPr>
-            <w:tcW w:type="dxa" w:w="1539"/>
+            <w:tcW w:type="dxa" w:w="1404"/>
             <w:tcMar>
               <w:top w:type="dxa" w:w="60"/>
               <w:left w:type="dxa" w:w="90"/>
@@ -3936,7 +3936,7 @@
         </w:tc>
         <w:tc>
           <w:tcPr>
-            <w:tcW w:type="dxa" w:w="5129"/>
+            <w:tcW w:type="dxa" w:w="3861"/>
             <w:tcMar>
               <w:top w:type="dxa" w:w="60"/>
               <w:left w:type="dxa" w:w="90"/>
@@ -3965,7 +3965,7 @@
         </w:trPr>
         <w:tc>
           <w:tcPr>
-            <w:tcW w:type="dxa" w:w="2693"/>
+            <w:tcW w:type="dxa" w:w="4095"/>
             <w:tcMar>
               <w:top w:type="dxa" w:w="60"/>
               <w:left w:type="dxa" w:w="90"/>
@@ -3991,7 +3991,7 @@
         </w:tc>
         <w:tc>
           <w:tcPr>
-            <w:tcW w:type="dxa" w:w="1539"/>
+            <w:tcW w:type="dxa" w:w="1404"/>
             <w:tcMar>
               <w:top w:type="dxa" w:w="60"/>
               <w:left w:type="dxa" w:w="90"/>
@@ -4017,7 +4017,7 @@
         </w:tc>
         <w:tc>
           <w:tcPr>
-            <w:tcW w:type="dxa" w:w="5129"/>
+            <w:tcW w:type="dxa" w:w="3861"/>
             <w:tcMar>
               <w:top w:type="dxa" w:w="60"/>
               <w:left w:type="dxa" w:w="90"/>
@@ -4037,7 +4037,7 @@
                 <w:sz w:val="17"/>
                 <w:szCs w:val="17"/>
               </w:rPr>
-              <w:t xml:space="preserve">약 245만 (기본 490만 → 약 740만)</w:t>
+              <w:t xml:space="preserve">약 240만 (기본 490만 → 약 730~740만)</w:t>
             </w:r>
           </w:p>
         </w:tc>
@@ -4664,15 +4664,15 @@
                 <w:sz w:val="17"/>
                 <w:szCs w:val="17"/>
               </w:rPr>
-              <w:t xml:space="preserve">단골 68명 직접 연락 1차 25명</w:t>
-            </w:r>
-            <w:r>
-              <w:rPr>
-                <w:rFonts w:ascii="Malgun Gothic" w:cs="Malgun Gothic" w:eastAsia="Malgun Gothic" w:hAnsi="Malgun Gothic"/>
-                <w:sz w:val="17"/>
-                <w:szCs w:val="17"/>
-              </w:rPr>
-              <w:t xml:space="preserve"> — "연휴에 3시간 이상 타시면 1시간 무료, 링크 먼저 드려요"</w:t>
+              <w:t xml:space="preserve">단골 40명 직접 연락 1차 14명</w:t>
+            </w:r>
+            <w:r>
+              <w:rPr>
+                <w:rFonts w:ascii="Malgun Gothic" w:cs="Malgun Gothic" w:eastAsia="Malgun Gothic" w:hAnsi="Malgun Gothic"/>
+                <w:sz w:val="17"/>
+                <w:szCs w:val="17"/>
+              </w:rPr>
+              <w:t xml:space="preserve"> (수신동의한 단골만) — "연휴에 3시간 이상 타시면 1시간 무료, 링크 먼저 드려요"</w:t>
             </w:r>
           </w:p>
         </w:tc>
@@ -5042,7 +5042,7 @@
                 <w:sz w:val="17"/>
                 <w:szCs w:val="17"/>
               </w:rPr>
-              <w:t xml:space="preserve"> 발송: 1,427명 (거래고객 147 + 9월 신규 동의 665 + 10월 신규 동의 92 + 이전 가입 동의 523) — 4절 명단</w:t>
+              <w:t xml:space="preserve"> 발송: 1,372명 (거래고객·수강생 92 + 9월 신규 동의 665 + 10월 신규 동의 92 + 이전 가입 동의 523) — 4절 명단</w:t>
             </w:r>
           </w:p>
         </w:tc>
@@ -5350,7 +5350,7 @@
                 <w:sz w:val="17"/>
                 <w:szCs w:val="17"/>
               </w:rPr>
-              <w:t xml:space="preserve">단골 직접 연락 2차 25명</w:t>
+              <w:t xml:space="preserve">단골 직접 연락 2차 13명</w:t>
             </w:r>
           </w:p>
         </w:tc>
@@ -6098,7 +6098,7 @@
                 <w:sz w:val="17"/>
                 <w:szCs w:val="17"/>
               </w:rPr>
-              <w:t xml:space="preserve">단골 직접 연락 마무리 18명 + 1차 무응답자 재연락</w:t>
+              <w:t xml:space="preserve">단골 직접 연락 마무리 13명 + 1차 무응답자 재연락</w:t>
             </w:r>
           </w:p>
         </w:tc>
@@ -7287,15 +7287,15 @@
                 <w:sz w:val="17"/>
                 <w:szCs w:val="17"/>
               </w:rPr>
-              <w:t xml:space="preserve">1,427명</w:t>
-            </w:r>
-            <w:r>
-              <w:rPr>
-                <w:rFonts w:ascii="Malgun Gothic" w:cs="Malgun Gothic" w:eastAsia="Malgun Gothic" w:hAnsi="Malgun Gothic"/>
-                <w:sz w:val="17"/>
-                <w:szCs w:val="17"/>
-              </w:rPr>
-              <w:t xml:space="preserve"> — 거래고객·수강생 동의 92 + 거래고객 수신동의 미응답 55 + 9월 신규 동의 665 + 10/1~10/6 신규 동의 92 + 이전 가입 동의 523</w:t>
+              <w:t xml:space="preserve">1,372명</w:t>
+            </w:r>
+            <w:r>
+              <w:rPr>
+                <w:rFonts w:ascii="Malgun Gothic" w:cs="Malgun Gothic" w:eastAsia="Malgun Gothic" w:hAnsi="Malgun Gothic"/>
+                <w:sz w:val="17"/>
+                <w:szCs w:val="17"/>
+              </w:rPr>
+              <w:t xml:space="preserve"> — 거래고객·수강생 동의 92 + 9월 신규 동의 665 + 10/1~10/6 신규 동의 92 + 이전 가입 동의 523</w:t>
             </w:r>
           </w:p>
         </w:tc>
@@ -7348,6 +7348,101 @@
                 <w:sz w:val="17"/>
                 <w:szCs w:val="17"/>
               </w:rPr>
+              <w:t xml:space="preserve">참고_미응답_동의받기</w:t>
+            </w:r>
+          </w:p>
+        </w:tc>
+        <w:tc>
+          <w:tcPr>
+            <w:tcW w:type="dxa" w:w="4114"/>
+            <w:tcMar>
+              <w:top w:type="dxa" w:w="60"/>
+              <w:left w:type="dxa" w:w="90"/>
+              <w:bottom w:type="dxa" w:w="60"/>
+              <w:right w:type="dxa" w:w="90"/>
+            </w:tcMar>
+          </w:tcPr>
+          <w:p>
+            <w:pPr>
+              <w:spacing w:after="0"/>
+            </w:pPr>
+            <w:r>
+              <w:rPr>
+                <w:rFonts w:ascii="Malgun Gothic" w:cs="Malgun Gothic" w:eastAsia="Malgun Gothic" w:hAnsi="Malgun Gothic"/>
+                <w:sz w:val="17"/>
+                <w:szCs w:val="17"/>
+              </w:rPr>
+              <w:t xml:space="preserve">55명</w:t>
+            </w:r>
+          </w:p>
+        </w:tc>
+        <w:tc>
+          <w:tcPr>
+            <w:tcW w:type="dxa" w:w="4114"/>
+            <w:tcMar>
+              <w:top w:type="dxa" w:w="60"/>
+              <w:left w:type="dxa" w:w="90"/>
+              <w:bottom w:type="dxa" w:w="60"/>
+              <w:right w:type="dxa" w:w="90"/>
+            </w:tcMar>
+          </w:tcPr>
+          <w:p>
+            <w:pPr>
+              <w:spacing w:after="0"/>
+            </w:pPr>
+            <w:r>
+              <w:rPr>
+                <w:rFonts w:ascii="Malgun Gothic" w:cs="Malgun Gothic" w:eastAsia="Malgun Gothic" w:hAnsi="Malgun Gothic"/>
+                <w:sz w:val="17"/>
+                <w:szCs w:val="17"/>
+              </w:rPr>
+              <w:t xml:space="preserve">수신동의 미응답 거래고객. 설문 도입 전 가입이라 동의를 받은 적이 없어 </w:t>
+            </w:r>
+            <w:r>
+              <w:rPr>
+                <w:rFonts w:ascii="Malgun Gothic" w:cs="Malgun Gothic" w:eastAsia="Malgun Gothic" w:hAnsi="Malgun Gothic"/>
+                <w:b/>
+                <w:bCs/>
+                <w:sz w:val="17"/>
+                <w:szCs w:val="17"/>
+              </w:rPr>
+              <w:t xml:space="preserve">광고 문자·직접 연락에서 뺀다.</w:t>
+            </w:r>
+            <w:r>
+              <w:rPr>
+                <w:rFonts w:ascii="Malgun Gothic" w:cs="Malgun Gothic" w:eastAsia="Malgun Gothic" w:hAnsi="Malgun Gothic"/>
+                <w:sz w:val="17"/>
+                <w:szCs w:val="17"/>
+              </w:rPr>
+              <w:t xml:space="preserve"> 다음 방문·반납 때 현장에서 수신동의를 받는다</w:t>
+            </w:r>
+          </w:p>
+        </w:tc>
+      </w:tr>
+      <w:tr>
+        <w:trPr>
+          <w:tblHeader w:val="false"/>
+        </w:trPr>
+        <w:tc>
+          <w:tcPr>
+            <w:tcW w:type="dxa" w:w="1131"/>
+            <w:tcMar>
+              <w:top w:type="dxa" w:w="60"/>
+              <w:left w:type="dxa" w:w="90"/>
+              <w:bottom w:type="dxa" w:w="60"/>
+              <w:right w:type="dxa" w:w="90"/>
+            </w:tcMar>
+          </w:tcPr>
+          <w:p>
+            <w:pPr>
+              <w:spacing w:after="0"/>
+            </w:pPr>
+            <w:r>
+              <w:rPr>
+                <w:rFonts w:ascii="Malgun Gothic" w:cs="Malgun Gothic" w:eastAsia="Malgun Gothic" w:hAnsi="Malgun Gothic"/>
+                <w:sz w:val="17"/>
+                <w:szCs w:val="17"/>
+              </w:rPr>
               <w:t xml:space="preserve">참고_단골직접연락</w:t>
             </w:r>
           </w:p>
@@ -7372,7 +7467,7 @@
                 <w:sz w:val="17"/>
                 <w:szCs w:val="17"/>
               </w:rPr>
-              <w:t xml:space="preserve">67명</w:t>
+              <w:t xml:space="preserve">40명</w:t>
             </w:r>
           </w:p>
         </w:tc>
@@ -7396,7 +7491,25 @@
                 <w:sz w:val="17"/>
                 <w:szCs w:val="17"/>
               </w:rPr>
-              <w:t xml:space="preserve">용산 2회 이상·1박 이상·누적 20만원 이상. 연락일(10/6·10/7·10/8) 배정, 결과·예약여부 칸 기록</w:t>
+              <w:t xml:space="preserve">용산 2회 이상·1박 이상·누적 20만원 이상 중 </w:t>
+            </w:r>
+            <w:r>
+              <w:rPr>
+                <w:rFonts w:ascii="Malgun Gothic" w:cs="Malgun Gothic" w:eastAsia="Malgun Gothic" w:hAnsi="Malgun Gothic"/>
+                <w:b/>
+                <w:bCs/>
+                <w:sz w:val="17"/>
+                <w:szCs w:val="17"/>
+              </w:rPr>
+              <w:t xml:space="preserve">수신동의한 사람만</w:t>
+            </w:r>
+            <w:r>
+              <w:rPr>
+                <w:rFonts w:ascii="Malgun Gothic" w:cs="Malgun Gothic" w:eastAsia="Malgun Gothic" w:hAnsi="Malgun Gothic"/>
+                <w:sz w:val="17"/>
+                <w:szCs w:val="17"/>
+              </w:rPr>
+              <w:t xml:space="preserve">. 연락일(10/6·10/7·10/8) 배정, 결과·예약여부 칸 기록</w:t>
             </w:r>
           </w:p>
         </w:tc>
@@ -7802,7 +7915,7 @@
           <w:sz w:val="20"/>
           <w:szCs w:val="20"/>
         </w:rPr>
-        <w:t xml:space="preserve">(9,190명)로 10/1~10/6 가입 동의자를 더하고, 모든 대상의 수신동의 상태를 현재 값으로 갱신했다(미응답 → 동의 1명). 10/6 결정으로 이전 가입 동의 회원과 수신동의 미응답 거래고객도 모두 포함했다. 발송 직전 최신 회원 설문을 넣고 다시 돌리면 새 가입자·수신거부가 반영된다.</w:t>
+        <w:t xml:space="preserve">(9,190명)로 10/1~10/6 가입 동의자를 더하고, 모든 대상의 수신동의 상태를 현재 값으로 갱신했다(미응답 → 동의 1명). 10/6 결정으로 이전 가입 동의 회원은 포함하고, 수신동의 미응답은 광고 문자와 단골 직접 연락 모두에서 뺐다(설문 도입 전 가입자는 동의를 받은 적이 없음). 발송 직전 최신 회원 설문을 넣고 다시 돌리면 새 가입자·수신거부가 반영된다.</w:t>
       </w:r>
     </w:p>
     <w:p>

</xml_diff>

<commit_message>
Add Korean-only poster-style ad images (feed 4:5, story 9:16) and point plan to them
Co-Authored-By: Claude Opus 5.5 <noreply@anthropic.com>
Claude-Session: https://claude.ai/code/session_01MNAKb9sccB4tN87nMGAtUU
</commit_message>
<xml_diff>
--- a/crm/output/용산_한글날_시승오퍼_실행계획_1006-1009.docx
+++ b/crm/output/용산_한글날_시승오퍼_실행계획_1006-1009.docx
@@ -5452,7 +5452,41 @@
                 <w:sz w:val="17"/>
                 <w:szCs w:val="17"/>
               </w:rPr>
-              <w:t xml:space="preserve">인스타 피드 "한글날엔 한 시간 더" 카드 게시 + 스토리</w:t>
+              <w:t xml:space="preserve">인스타 피드 "한글날엔 한 시간 더" 포스터(</w:t>
+            </w:r>
+            <w:r>
+              <w:rPr>
+                <w:rFonts w:ascii="Consolas" w:cs="Consolas" w:eastAsia="Consolas" w:hAnsi="Consolas"/>
+                <w:color w:val="7C2D12"/>
+                <w:sz w:val="17"/>
+                <w:szCs w:val="17"/>
+              </w:rPr>
+              <w:t xml:space="preserve">hangul-1009-poster-feed</w:t>
+            </w:r>
+            <w:r>
+              <w:rPr>
+                <w:rFonts w:ascii="Malgun Gothic" w:cs="Malgun Gothic" w:eastAsia="Malgun Gothic" w:hAnsi="Malgun Gothic"/>
+                <w:sz w:val="17"/>
+                <w:szCs w:val="17"/>
+              </w:rPr>
+              <w:t xml:space="preserve">) 게시 + 스토리(</w:t>
+            </w:r>
+            <w:r>
+              <w:rPr>
+                <w:rFonts w:ascii="Consolas" w:cs="Consolas" w:eastAsia="Consolas" w:hAnsi="Consolas"/>
+                <w:color w:val="7C2D12"/>
+                <w:sz w:val="17"/>
+                <w:szCs w:val="17"/>
+              </w:rPr>
+              <w:t xml:space="preserve">hangul-1009-poster-story</w:t>
+            </w:r>
+            <w:r>
+              <w:rPr>
+                <w:rFonts w:ascii="Malgun Gothic" w:cs="Malgun Gothic" w:eastAsia="Malgun Gothic" w:hAnsi="Malgun Gothic"/>
+                <w:sz w:val="17"/>
+                <w:szCs w:val="17"/>
+              </w:rPr>
+              <w:t xml:space="preserve">)</w:t>
             </w:r>
           </w:p>
         </w:tc>
@@ -8747,15 +8781,15 @@
                 <w:sz w:val="17"/>
                 <w:szCs w:val="17"/>
               </w:rPr>
-              <w:t xml:space="preserve">designs/hangul-1009/export/hangul-1009-ig-onehour-1080x1350.png</w:t>
-            </w:r>
-            <w:r>
-              <w:rPr>
-                <w:rFonts w:ascii="Malgun Gothic" w:cs="Malgun Gothic" w:eastAsia="Malgun Gothic" w:hAnsi="Malgun Gothic"/>
-                <w:sz w:val="17"/>
-                <w:szCs w:val="17"/>
-              </w:rPr>
-              <w:t xml:space="preserve"> (4:5)</w:t>
+              <w:t xml:space="preserve">designs/hangul-1009/export/hangul-1009-poster-feed-1080x1350.png</w:t>
+            </w:r>
+            <w:r>
+              <w:rPr>
+                <w:rFonts w:ascii="Malgun Gothic" w:cs="Malgun Gothic" w:eastAsia="Malgun Gothic" w:hAnsi="Malgun Gothic"/>
+                <w:sz w:val="17"/>
+                <w:szCs w:val="17"/>
+              </w:rPr>
+              <w:t xml:space="preserve"> (4:5, 한글 포스터형)</w:t>
             </w:r>
           </w:p>
         </w:tc>
@@ -8811,15 +8845,15 @@
                 <w:sz w:val="17"/>
                 <w:szCs w:val="17"/>
               </w:rPr>
-              <w:t xml:space="preserve">designs/hangul-1009/export/hangul-1009-ig-onehour-story-1080x1920.png</w:t>
-            </w:r>
-            <w:r>
-              <w:rPr>
-                <w:rFonts w:ascii="Malgun Gothic" w:cs="Malgun Gothic" w:eastAsia="Malgun Gothic" w:hAnsi="Malgun Gothic"/>
-                <w:sz w:val="17"/>
-                <w:szCs w:val="17"/>
-              </w:rPr>
-              <w:t xml:space="preserve"> (9:16)</w:t>
+              <w:t xml:space="preserve">designs/hangul-1009/export/hangul-1009-poster-story-1080x1920.png</w:t>
+            </w:r>
+            <w:r>
+              <w:rPr>
+                <w:rFonts w:ascii="Malgun Gothic" w:cs="Malgun Gothic" w:eastAsia="Malgun Gothic" w:hAnsi="Malgun Gothic"/>
+                <w:sz w:val="17"/>
+                <w:szCs w:val="17"/>
+              </w:rPr>
+              <w:t xml:space="preserve"> (9:16, 한글 포스터형)</w:t>
             </w:r>
           </w:p>
         </w:tc>
@@ -10827,7 +10861,7 @@
           <w:sz w:val="16"/>
           <w:szCs w:val="16"/>
         </w:rPr>
-        <w:t xml:space="preserve">hangul-1009-ig-onehour-1080x1350.png</w:t>
+        <w:t xml:space="preserve">hangul-1009-poster-feed-1080x1350.png</w:t>
       </w:r>
     </w:p>
     <w:p>
@@ -10888,7 +10922,7 @@
           <w:sz w:val="16"/>
           <w:szCs w:val="16"/>
         </w:rPr>
-        <w:t xml:space="preserve">hangul-1009-ig-onehour-story-1080x1920.png</w:t>
+        <w:t xml:space="preserve">hangul-1009-poster-story-1080x1920.png</w:t>
       </w:r>
     </w:p>
     <w:sectPr>

</xml_diff>

<commit_message>
Change Hangul Day promo link code to 한글1009 (URL-encoded in links)
Co-Authored-By: Claude Opus 5.5 <noreply@anthropic.com>
Claude-Session: https://claude.ai/code/session_01MNAKb9sccB4tN87nMGAtUU
</commit_message>
<xml_diff>
--- a/crm/output/용산_한글날_시승오퍼_실행계획_1006-1009.docx
+++ b/crm/output/용산_한글날_시승오퍼_실행계획_1006-1009.docx
@@ -1193,15 +1193,32 @@
                 <w:sz w:val="17"/>
                 <w:szCs w:val="17"/>
               </w:rPr>
-              <w:t xml:space="preserve">hour-1009</w:t>
-            </w:r>
-            <w:r>
-              <w:rPr>
-                <w:rFonts w:ascii="Malgun Gothic" w:cs="Malgun Gothic" w:eastAsia="Malgun Gothic" w:hAnsi="Malgun Gothic"/>
-                <w:sz w:val="17"/>
-                <w:szCs w:val="17"/>
-              </w:rPr>
-              <w:t xml:space="preserve"> (다른 코드로 만들면 아래 모든 링크의 </w:t>
+              <w:t xml:space="preserve">한글1009</w:t>
+            </w:r>
+            <w:r>
+              <w:rPr>
+                <w:rFonts w:ascii="Malgun Gothic" w:cs="Malgun Gothic" w:eastAsia="Malgun Gothic" w:hAnsi="Malgun Gothic"/>
+                <w:sz w:val="17"/>
+                <w:szCs w:val="17"/>
+              </w:rPr>
+              <w:t xml:space="preserve"> (링크에는 한글이 깨지지 않도록 </w:t>
+            </w:r>
+            <w:r>
+              <w:rPr>
+                <w:rFonts w:ascii="Consolas" w:cs="Consolas" w:eastAsia="Consolas" w:hAnsi="Consolas"/>
+                <w:color w:val="7C2D12"/>
+                <w:sz w:val="17"/>
+                <w:szCs w:val="17"/>
+              </w:rPr>
+              <w:t xml:space="preserve">%ED%95%9C%EA%B8%801009</w:t>
+            </w:r>
+            <w:r>
+              <w:rPr>
+                <w:rFonts w:ascii="Malgun Gothic" w:cs="Malgun Gothic" w:eastAsia="Malgun Gothic" w:hAnsi="Malgun Gothic"/>
+                <w:sz w:val="17"/>
+                <w:szCs w:val="17"/>
+              </w:rPr>
+              <w:t xml:space="preserve">로 인코딩해 넣었다. 다른 코드로 만들면 모든 링크의 </w:t>
             </w:r>
             <w:r>
               <w:rPr>
@@ -1643,7 +1660,7 @@
           <w:sz w:val="18"/>
           <w:szCs w:val="18"/>
         </w:rPr>
-        <w:t xml:space="preserve">promo=hour-1009</w:t>
+        <w:t xml:space="preserve">promo=%ED%95%9C%EA%B8%801009</w:t>
       </w:r>
       <w:r>
         <w:rPr>
@@ -1797,7 +1814,7 @@
                 <w:sz w:val="17"/>
                 <w:szCs w:val="17"/>
               </w:rPr>
-              <w:t xml:space="preserve">https://www.artefine.co.kr/?promo=hour-1009&amp;utm_source=sms&amp;utm_medium=lms&amp;utm_campaign=1009hangul</w:t>
+              <w:t xml:space="preserve">https://www.artefine.co.kr/?promo=%ED%95%9C%EA%B8%801009&amp;utm_source=sms&amp;utm_medium=lms&amp;utm_campaign=1009hangul</w:t>
             </w:r>
           </w:p>
         </w:tc>
@@ -1851,7 +1868,7 @@
                 <w:sz w:val="17"/>
                 <w:szCs w:val="17"/>
               </w:rPr>
-              <w:t xml:space="preserve">https://www.artefine.co.kr/?promo=hour-1009&amp;utm_source=ig&amp;utm_medium=social&amp;utm_campaign=1009hangul</w:t>
+              <w:t xml:space="preserve">https://www.artefine.co.kr/?promo=%ED%95%9C%EA%B8%801009&amp;utm_source=ig&amp;utm_medium=social&amp;utm_campaign=1009hangul</w:t>
             </w:r>
           </w:p>
         </w:tc>
@@ -1905,7 +1922,7 @@
                 <w:sz w:val="17"/>
                 <w:szCs w:val="17"/>
               </w:rPr>
-              <w:t xml:space="preserve">https://www.artefine.co.kr/?promo=hour-1009&amp;utm_source=community&amp;utm_medium=social&amp;utm_campaign=1009hangul</w:t>
+              <w:t xml:space="preserve">https://www.artefine.co.kr/?promo=%ED%95%9C%EA%B8%801009&amp;utm_source=community&amp;utm_medium=social&amp;utm_campaign=1009hangul</w:t>
             </w:r>
           </w:p>
         </w:tc>
@@ -1961,7 +1978,7 @@
                 <w:sz w:val="17"/>
                 <w:szCs w:val="17"/>
               </w:rPr>
-              <w:t xml:space="preserve">https://www.artefine.co.kr/?promo=hour-1009&amp;utm_source=meta&amp;utm_medium=paid&amp;utm_campaign=1009hangul&amp;utm_content=feed</w:t>
+              <w:t xml:space="preserve">https://www.artefine.co.kr/?promo=%ED%95%9C%EA%B8%801009&amp;utm_source=meta&amp;utm_medium=paid&amp;utm_campaign=1009hangul&amp;utm_content=feed</w:t>
             </w:r>
           </w:p>
         </w:tc>
@@ -2017,7 +2034,7 @@
                 <w:sz w:val="17"/>
                 <w:szCs w:val="17"/>
               </w:rPr>
-              <w:t xml:space="preserve">https://www.artefine.co.kr/?promo=hour-1009&amp;utm_source=meta&amp;utm_medium=paid&amp;utm_campaign=1009hangul&amp;utm_content=story</w:t>
+              <w:t xml:space="preserve">https://www.artefine.co.kr/?promo=%ED%95%9C%EA%B8%801009&amp;utm_source=meta&amp;utm_medium=paid&amp;utm_campaign=1009hangul&amp;utm_content=story</w:t>
             </w:r>
           </w:p>
         </w:tc>
@@ -2073,7 +2090,7 @@
                 <w:sz w:val="17"/>
                 <w:szCs w:val="17"/>
               </w:rPr>
-              <w:t xml:space="preserve">https://www.artefine.co.kr/?promo=hour-1009&amp;utm_source=naver&amp;utm_medium=cpc&amp;utm_campaign=1009hangul</w:t>
+              <w:t xml:space="preserve">https://www.artefine.co.kr/?promo=%ED%95%9C%EA%B8%801009&amp;utm_source=naver&amp;utm_medium=cpc&amp;utm_campaign=1009hangul</w:t>
             </w:r>
           </w:p>
         </w:tc>
@@ -4689,7 +4706,7 @@
                 <w:sz w:val="17"/>
                 <w:szCs w:val="17"/>
               </w:rPr>
-              <w:t xml:space="preserve">hour-1009</w:t>
+              <w:t xml:space="preserve">한글1009</w:t>
             </w:r>
             <w:r>
               <w:rPr>
@@ -8083,7 +8100,7 @@
                 <w:sz w:val="19"/>
                 <w:szCs w:val="19"/>
               </w:rPr>
-              <w:t xml:space="preserve">https://www.artefine.co.kr/?promo=hour-1009&amp;utm_source=sms&amp;utm_medium=lms&amp;utm_campaign=1009hangul</w:t>
+              <w:t xml:space="preserve">https://www.artefine.co.kr/?promo=%ED%95%9C%EA%B8%801009&amp;utm_source=sms&amp;utm_medium=lms&amp;utm_campaign=1009hangul</w:t>
             </w:r>
           </w:p>
           <w:p>
@@ -8289,7 +8306,7 @@
                 <w:sz w:val="19"/>
                 <w:szCs w:val="19"/>
               </w:rPr>
-              <w:t xml:space="preserve">▶ https://www.artefine.co.kr/?promo=hour-1009&amp;utm_source=sms&amp;utm_medium=lms&amp;utm_campaign=1009hangul</w:t>
+              <w:t xml:space="preserve">▶ https://www.artefine.co.kr/?promo=%ED%95%9C%EA%B8%801009&amp;utm_source=sms&amp;utm_medium=lms&amp;utm_campaign=1009hangul</w:t>
             </w:r>
           </w:p>
           <w:p>

</xml_diff>

<commit_message>
Use registered promo code hangul1009 in all links
Co-Authored-By: Claude Opus 5.5 <noreply@anthropic.com>
Claude-Session: https://claude.ai/code/session_01MNAKb9sccB4tN87nMGAtUU
</commit_message>
<xml_diff>
--- a/crm/output/용산_한글날_시승오퍼_실행계획_1006-1009.docx
+++ b/crm/output/용산_한글날_시승오퍼_실행계획_1006-1009.docx
@@ -1193,32 +1193,15 @@
                 <w:sz w:val="17"/>
                 <w:szCs w:val="17"/>
               </w:rPr>
-              <w:t xml:space="preserve">한글1009</w:t>
-            </w:r>
-            <w:r>
-              <w:rPr>
-                <w:rFonts w:ascii="Malgun Gothic" w:cs="Malgun Gothic" w:eastAsia="Malgun Gothic" w:hAnsi="Malgun Gothic"/>
-                <w:sz w:val="17"/>
-                <w:szCs w:val="17"/>
-              </w:rPr>
-              <w:t xml:space="preserve"> (링크에는 한글이 깨지지 않도록 </w:t>
-            </w:r>
-            <w:r>
-              <w:rPr>
-                <w:rFonts w:ascii="Consolas" w:cs="Consolas" w:eastAsia="Consolas" w:hAnsi="Consolas"/>
-                <w:color w:val="7C2D12"/>
-                <w:sz w:val="17"/>
-                <w:szCs w:val="17"/>
-              </w:rPr>
-              <w:t xml:space="preserve">%ED%95%9C%EA%B8%801009</w:t>
-            </w:r>
-            <w:r>
-              <w:rPr>
-                <w:rFonts w:ascii="Malgun Gothic" w:cs="Malgun Gothic" w:eastAsia="Malgun Gothic" w:hAnsi="Malgun Gothic"/>
-                <w:sz w:val="17"/>
-                <w:szCs w:val="17"/>
-              </w:rPr>
-              <w:t xml:space="preserve">로 인코딩해 넣었다. 다른 코드로 만들면 모든 링크의 </w:t>
+              <w:t xml:space="preserve">hangul1009</w:t>
+            </w:r>
+            <w:r>
+              <w:rPr>
+                <w:rFonts w:ascii="Malgun Gothic" w:cs="Malgun Gothic" w:eastAsia="Malgun Gothic" w:hAnsi="Malgun Gothic"/>
+                <w:sz w:val="17"/>
+                <w:szCs w:val="17"/>
+              </w:rPr>
+              <w:t xml:space="preserve"> (10/6 등록 완료. 다른 코드로 바꾸면 모든 링크의 </w:t>
             </w:r>
             <w:r>
               <w:rPr>
@@ -1660,7 +1643,7 @@
           <w:sz w:val="18"/>
           <w:szCs w:val="18"/>
         </w:rPr>
-        <w:t xml:space="preserve">promo=%ED%95%9C%EA%B8%801009</w:t>
+        <w:t xml:space="preserve">promo=hangul1009</w:t>
       </w:r>
       <w:r>
         <w:rPr>
@@ -1814,7 +1797,7 @@
                 <w:sz w:val="17"/>
                 <w:szCs w:val="17"/>
               </w:rPr>
-              <w:t xml:space="preserve">https://www.artefine.co.kr/?promo=%ED%95%9C%EA%B8%801009&amp;utm_source=sms&amp;utm_medium=lms&amp;utm_campaign=1009hangul</w:t>
+              <w:t xml:space="preserve">https://www.artefine.co.kr/?promo=hangul1009&amp;utm_source=sms&amp;utm_medium=lms&amp;utm_campaign=1009hangul</w:t>
             </w:r>
           </w:p>
         </w:tc>
@@ -1868,7 +1851,7 @@
                 <w:sz w:val="17"/>
                 <w:szCs w:val="17"/>
               </w:rPr>
-              <w:t xml:space="preserve">https://www.artefine.co.kr/?promo=%ED%95%9C%EA%B8%801009&amp;utm_source=ig&amp;utm_medium=social&amp;utm_campaign=1009hangul</w:t>
+              <w:t xml:space="preserve">https://www.artefine.co.kr/?promo=hangul1009&amp;utm_source=ig&amp;utm_medium=social&amp;utm_campaign=1009hangul</w:t>
             </w:r>
           </w:p>
         </w:tc>
@@ -1922,7 +1905,7 @@
                 <w:sz w:val="17"/>
                 <w:szCs w:val="17"/>
               </w:rPr>
-              <w:t xml:space="preserve">https://www.artefine.co.kr/?promo=%ED%95%9C%EA%B8%801009&amp;utm_source=community&amp;utm_medium=social&amp;utm_campaign=1009hangul</w:t>
+              <w:t xml:space="preserve">https://www.artefine.co.kr/?promo=hangul1009&amp;utm_source=community&amp;utm_medium=social&amp;utm_campaign=1009hangul</w:t>
             </w:r>
           </w:p>
         </w:tc>
@@ -1978,7 +1961,7 @@
                 <w:sz w:val="17"/>
                 <w:szCs w:val="17"/>
               </w:rPr>
-              <w:t xml:space="preserve">https://www.artefine.co.kr/?promo=%ED%95%9C%EA%B8%801009&amp;utm_source=meta&amp;utm_medium=paid&amp;utm_campaign=1009hangul&amp;utm_content=feed</w:t>
+              <w:t xml:space="preserve">https://www.artefine.co.kr/?promo=hangul1009&amp;utm_source=meta&amp;utm_medium=paid&amp;utm_campaign=1009hangul&amp;utm_content=feed</w:t>
             </w:r>
           </w:p>
         </w:tc>
@@ -2034,7 +2017,7 @@
                 <w:sz w:val="17"/>
                 <w:szCs w:val="17"/>
               </w:rPr>
-              <w:t xml:space="preserve">https://www.artefine.co.kr/?promo=%ED%95%9C%EA%B8%801009&amp;utm_source=meta&amp;utm_medium=paid&amp;utm_campaign=1009hangul&amp;utm_content=story</w:t>
+              <w:t xml:space="preserve">https://www.artefine.co.kr/?promo=hangul1009&amp;utm_source=meta&amp;utm_medium=paid&amp;utm_campaign=1009hangul&amp;utm_content=story</w:t>
             </w:r>
           </w:p>
         </w:tc>
@@ -2090,7 +2073,7 @@
                 <w:sz w:val="17"/>
                 <w:szCs w:val="17"/>
               </w:rPr>
-              <w:t xml:space="preserve">https://www.artefine.co.kr/?promo=%ED%95%9C%EA%B8%801009&amp;utm_source=naver&amp;utm_medium=cpc&amp;utm_campaign=1009hangul</w:t>
+              <w:t xml:space="preserve">https://www.artefine.co.kr/?promo=hangul1009&amp;utm_source=naver&amp;utm_medium=cpc&amp;utm_campaign=1009hangul</w:t>
             </w:r>
           </w:p>
         </w:tc>
@@ -4706,7 +4689,7 @@
                 <w:sz w:val="17"/>
                 <w:szCs w:val="17"/>
               </w:rPr>
-              <w:t xml:space="preserve">한글1009</w:t>
+              <w:t xml:space="preserve">hangul1009</w:t>
             </w:r>
             <w:r>
               <w:rPr>
@@ -8100,7 +8083,7 @@
                 <w:sz w:val="19"/>
                 <w:szCs w:val="19"/>
               </w:rPr>
-              <w:t xml:space="preserve">https://www.artefine.co.kr/?promo=%ED%95%9C%EA%B8%801009&amp;utm_source=sms&amp;utm_medium=lms&amp;utm_campaign=1009hangul</w:t>
+              <w:t xml:space="preserve">https://www.artefine.co.kr/?promo=hangul1009&amp;utm_source=sms&amp;utm_medium=lms&amp;utm_campaign=1009hangul</w:t>
             </w:r>
           </w:p>
           <w:p>
@@ -8306,7 +8289,7 @@
                 <w:sz w:val="19"/>
                 <w:szCs w:val="19"/>
               </w:rPr>
-              <w:t xml:space="preserve">▶ https://www.artefine.co.kr/?promo=%ED%95%9C%EA%B8%801009&amp;utm_source=sms&amp;utm_medium=lms&amp;utm_campaign=1009hangul</w:t>
+              <w:t xml:space="preserve">▶ https://www.artefine.co.kr/?promo=hangul1009&amp;utm_source=sms&amp;utm_medium=lms&amp;utm_campaign=1009hangul</w:t>
             </w:r>
           </w:p>
           <w:p>

</xml_diff>